<commit_message>
to finished video 1
</commit_message>
<xml_diff>
--- a/note googlespreedsheet.docx
+++ b/note googlespreedsheet.docx
@@ -184,16 +184,14 @@
           <w:szCs w:val="24"/>
         </w:rPr>
       </w:pPr>
-      <w:proofErr w:type="spellStart"/>
-      <w:r>
-        <w:rPr>
-          <w:rFonts w:ascii="Arial Narrow" w:hAnsi="Arial Narrow"/>
-          <w:sz w:val="24"/>
-          <w:szCs w:val="24"/>
-        </w:rPr>
-        <w:t>Zcvzxcvzx</w:t>
-      </w:r>
-      <w:proofErr w:type="spellEnd"/>
+      <w:r>
+        <w:rPr>
+          <w:rFonts w:ascii="Arial Narrow" w:hAnsi="Arial Narrow"/>
+          <w:sz w:val="24"/>
+          <w:szCs w:val="24"/>
+        </w:rPr>
+        <w:t>How to open project before start project:</w:t>
+      </w:r>
     </w:p>
     <w:p>
       <w:pPr>
@@ -204,16 +202,14 @@
           <w:szCs w:val="24"/>
         </w:rPr>
       </w:pPr>
-      <w:proofErr w:type="spellStart"/>
-      <w:r>
-        <w:rPr>
-          <w:rFonts w:ascii="Arial Narrow" w:hAnsi="Arial Narrow"/>
-          <w:sz w:val="24"/>
-          <w:szCs w:val="24"/>
-        </w:rPr>
-        <w:t>Dassd</w:t>
-      </w:r>
-      <w:proofErr w:type="spellEnd"/>
+      <w:r>
+        <w:rPr>
+          <w:rFonts w:ascii="Arial Narrow" w:hAnsi="Arial Narrow"/>
+          <w:sz w:val="24"/>
+          <w:szCs w:val="24"/>
+        </w:rPr>
+        <w:t>Sign in google drive:</w:t>
+      </w:r>
     </w:p>
     <w:p>
       <w:pPr>
@@ -224,16 +220,59 @@
           <w:szCs w:val="24"/>
         </w:rPr>
       </w:pPr>
-      <w:proofErr w:type="spellStart"/>
-      <w:r>
-        <w:rPr>
-          <w:rFonts w:ascii="Arial Narrow" w:hAnsi="Arial Narrow"/>
-          <w:sz w:val="24"/>
-          <w:szCs w:val="24"/>
-        </w:rPr>
-        <w:t>Asdgasdg</w:t>
-      </w:r>
-      <w:proofErr w:type="spellEnd"/>
+      <w:r>
+        <w:rPr>
+          <w:noProof/>
+        </w:rPr>
+        <w:drawing>
+          <wp:inline distT="0" distB="0" distL="0" distR="0" wp14:anchorId="0F318828" wp14:editId="65C71193">
+            <wp:extent cx="5731510" cy="1997075"/>
+            <wp:effectExtent l="0" t="0" r="2540" b="3175"/>
+            <wp:docPr id="1318826547" name="Picture 2"/>
+            <wp:cNvGraphicFramePr>
+              <a:graphicFrameLocks xmlns:a="http://schemas.openxmlformats.org/drawingml/2006/main" noChangeAspect="1"/>
+            </wp:cNvGraphicFramePr>
+            <a:graphic xmlns:a="http://schemas.openxmlformats.org/drawingml/2006/main">
+              <a:graphicData uri="http://schemas.openxmlformats.org/drawingml/2006/picture">
+                <pic:pic xmlns:pic="http://schemas.openxmlformats.org/drawingml/2006/picture">
+                  <pic:nvPicPr>
+                    <pic:cNvPr id="0" name="Picture 6"/>
+                    <pic:cNvPicPr>
+                      <a:picLocks noChangeAspect="1" noChangeArrowheads="1"/>
+                    </pic:cNvPicPr>
+                  </pic:nvPicPr>
+                  <pic:blipFill>
+                    <a:blip r:embed="rId7" cstate="print">
+                      <a:extLst>
+                        <a:ext uri="{28A0092B-C50C-407E-A947-70E740481C1C}">
+                          <a14:useLocalDpi xmlns:a14="http://schemas.microsoft.com/office/drawing/2010/main" val="0"/>
+                        </a:ext>
+                      </a:extLst>
+                    </a:blip>
+                    <a:srcRect/>
+                    <a:stretch>
+                      <a:fillRect/>
+                    </a:stretch>
+                  </pic:blipFill>
+                  <pic:spPr bwMode="auto">
+                    <a:xfrm>
+                      <a:off x="0" y="0"/>
+                      <a:ext cx="5731510" cy="1997075"/>
+                    </a:xfrm>
+                    <a:prstGeom prst="rect">
+                      <a:avLst/>
+                    </a:prstGeom>
+                    <a:noFill/>
+                    <a:ln>
+                      <a:noFill/>
+                    </a:ln>
+                  </pic:spPr>
+                </pic:pic>
+              </a:graphicData>
+            </a:graphic>
+          </wp:inline>
+        </w:drawing>
+      </w:r>
     </w:p>
     <w:p>
       <w:pPr>
@@ -245,8 +284,3542 @@
         </w:rPr>
       </w:pPr>
     </w:p>
+    <w:p>
+      <w:pPr>
+        <w:spacing w:after="0" w:line="240" w:lineRule="auto"/>
+        <w:rPr>
+          <w:rFonts w:ascii="Arial Narrow" w:hAnsi="Arial Narrow"/>
+          <w:sz w:val="24"/>
+          <w:szCs w:val="24"/>
+        </w:rPr>
+      </w:pPr>
+      <w:r>
+        <w:rPr>
+          <w:noProof/>
+        </w:rPr>
+        <w:drawing>
+          <wp:inline distT="0" distB="0" distL="0" distR="0" wp14:anchorId="03EC4E1B" wp14:editId="6A44A050">
+            <wp:extent cx="5731510" cy="1471930"/>
+            <wp:effectExtent l="0" t="0" r="2540" b="0"/>
+            <wp:docPr id="1271658481" name="Picture 3"/>
+            <wp:cNvGraphicFramePr>
+              <a:graphicFrameLocks xmlns:a="http://schemas.openxmlformats.org/drawingml/2006/main" noChangeAspect="1"/>
+            </wp:cNvGraphicFramePr>
+            <a:graphic xmlns:a="http://schemas.openxmlformats.org/drawingml/2006/main">
+              <a:graphicData uri="http://schemas.openxmlformats.org/drawingml/2006/picture">
+                <pic:pic xmlns:pic="http://schemas.openxmlformats.org/drawingml/2006/picture">
+                  <pic:nvPicPr>
+                    <pic:cNvPr id="0" name="Picture 8"/>
+                    <pic:cNvPicPr>
+                      <a:picLocks noChangeAspect="1" noChangeArrowheads="1"/>
+                    </pic:cNvPicPr>
+                  </pic:nvPicPr>
+                  <pic:blipFill>
+                    <a:blip r:embed="rId8" cstate="print">
+                      <a:extLst>
+                        <a:ext uri="{28A0092B-C50C-407E-A947-70E740481C1C}">
+                          <a14:useLocalDpi xmlns:a14="http://schemas.microsoft.com/office/drawing/2010/main" val="0"/>
+                        </a:ext>
+                      </a:extLst>
+                    </a:blip>
+                    <a:srcRect/>
+                    <a:stretch>
+                      <a:fillRect/>
+                    </a:stretch>
+                  </pic:blipFill>
+                  <pic:spPr bwMode="auto">
+                    <a:xfrm>
+                      <a:off x="0" y="0"/>
+                      <a:ext cx="5731510" cy="1471930"/>
+                    </a:xfrm>
+                    <a:prstGeom prst="rect">
+                      <a:avLst/>
+                    </a:prstGeom>
+                    <a:noFill/>
+                    <a:ln>
+                      <a:noFill/>
+                    </a:ln>
+                  </pic:spPr>
+                </pic:pic>
+              </a:graphicData>
+            </a:graphic>
+          </wp:inline>
+        </w:drawing>
+      </w:r>
+    </w:p>
+    <w:p>
+      <w:pPr>
+        <w:spacing w:after="0" w:line="240" w:lineRule="auto"/>
+        <w:rPr>
+          <w:rFonts w:ascii="Arial Narrow" w:hAnsi="Arial Narrow"/>
+          <w:sz w:val="24"/>
+          <w:szCs w:val="24"/>
+        </w:rPr>
+      </w:pPr>
+      <w:r>
+        <w:rPr>
+          <w:noProof/>
+        </w:rPr>
+        <w:drawing>
+          <wp:inline distT="0" distB="0" distL="0" distR="0" wp14:anchorId="3A0C3E54" wp14:editId="230999F8">
+            <wp:extent cx="5731510" cy="2048510"/>
+            <wp:effectExtent l="0" t="0" r="2540" b="8890"/>
+            <wp:docPr id="727229" name="Picture 4"/>
+            <wp:cNvGraphicFramePr>
+              <a:graphicFrameLocks xmlns:a="http://schemas.openxmlformats.org/drawingml/2006/main" noChangeAspect="1"/>
+            </wp:cNvGraphicFramePr>
+            <a:graphic xmlns:a="http://schemas.openxmlformats.org/drawingml/2006/main">
+              <a:graphicData uri="http://schemas.openxmlformats.org/drawingml/2006/picture">
+                <pic:pic xmlns:pic="http://schemas.openxmlformats.org/drawingml/2006/picture">
+                  <pic:nvPicPr>
+                    <pic:cNvPr id="0" name="Picture 10"/>
+                    <pic:cNvPicPr>
+                      <a:picLocks noChangeAspect="1" noChangeArrowheads="1"/>
+                    </pic:cNvPicPr>
+                  </pic:nvPicPr>
+                  <pic:blipFill>
+                    <a:blip r:embed="rId9">
+                      <a:extLst>
+                        <a:ext uri="{28A0092B-C50C-407E-A947-70E740481C1C}">
+                          <a14:useLocalDpi xmlns:a14="http://schemas.microsoft.com/office/drawing/2010/main" val="0"/>
+                        </a:ext>
+                      </a:extLst>
+                    </a:blip>
+                    <a:srcRect/>
+                    <a:stretch>
+                      <a:fillRect/>
+                    </a:stretch>
+                  </pic:blipFill>
+                  <pic:spPr bwMode="auto">
+                    <a:xfrm>
+                      <a:off x="0" y="0"/>
+                      <a:ext cx="5731510" cy="2048510"/>
+                    </a:xfrm>
+                    <a:prstGeom prst="rect">
+                      <a:avLst/>
+                    </a:prstGeom>
+                    <a:noFill/>
+                    <a:ln>
+                      <a:noFill/>
+                    </a:ln>
+                  </pic:spPr>
+                </pic:pic>
+              </a:graphicData>
+            </a:graphic>
+          </wp:inline>
+        </w:drawing>
+      </w:r>
+    </w:p>
+    <w:p>
+      <w:pPr>
+        <w:spacing w:after="0" w:line="240" w:lineRule="auto"/>
+        <w:rPr>
+          <w:rFonts w:ascii="Arial Narrow" w:hAnsi="Arial Narrow"/>
+          <w:sz w:val="24"/>
+          <w:szCs w:val="24"/>
+        </w:rPr>
+      </w:pPr>
+    </w:p>
+    <w:p>
+      <w:pPr>
+        <w:spacing w:after="0" w:line="240" w:lineRule="auto"/>
+        <w:rPr>
+          <w:rFonts w:ascii="Arial Narrow" w:hAnsi="Arial Narrow"/>
+          <w:sz w:val="24"/>
+          <w:szCs w:val="24"/>
+        </w:rPr>
+      </w:pPr>
+      <w:r>
+        <w:rPr>
+          <w:noProof/>
+        </w:rPr>
+        <w:drawing>
+          <wp:inline distT="0" distB="0" distL="0" distR="0" wp14:anchorId="70F15D13" wp14:editId="6535C7AD">
+            <wp:extent cx="5731510" cy="2337435"/>
+            <wp:effectExtent l="0" t="0" r="2540" b="5715"/>
+            <wp:docPr id="1172034957" name="Picture 5"/>
+            <wp:cNvGraphicFramePr>
+              <a:graphicFrameLocks xmlns:a="http://schemas.openxmlformats.org/drawingml/2006/main" noChangeAspect="1"/>
+            </wp:cNvGraphicFramePr>
+            <a:graphic xmlns:a="http://schemas.openxmlformats.org/drawingml/2006/main">
+              <a:graphicData uri="http://schemas.openxmlformats.org/drawingml/2006/picture">
+                <pic:pic xmlns:pic="http://schemas.openxmlformats.org/drawingml/2006/picture">
+                  <pic:nvPicPr>
+                    <pic:cNvPr id="0" name="Picture 12"/>
+                    <pic:cNvPicPr>
+                      <a:picLocks noChangeAspect="1" noChangeArrowheads="1"/>
+                    </pic:cNvPicPr>
+                  </pic:nvPicPr>
+                  <pic:blipFill>
+                    <a:blip r:embed="rId10">
+                      <a:extLst>
+                        <a:ext uri="{28A0092B-C50C-407E-A947-70E740481C1C}">
+                          <a14:useLocalDpi xmlns:a14="http://schemas.microsoft.com/office/drawing/2010/main" val="0"/>
+                        </a:ext>
+                      </a:extLst>
+                    </a:blip>
+                    <a:srcRect/>
+                    <a:stretch>
+                      <a:fillRect/>
+                    </a:stretch>
+                  </pic:blipFill>
+                  <pic:spPr bwMode="auto">
+                    <a:xfrm>
+                      <a:off x="0" y="0"/>
+                      <a:ext cx="5731510" cy="2337435"/>
+                    </a:xfrm>
+                    <a:prstGeom prst="rect">
+                      <a:avLst/>
+                    </a:prstGeom>
+                    <a:noFill/>
+                    <a:ln>
+                      <a:noFill/>
+                    </a:ln>
+                  </pic:spPr>
+                </pic:pic>
+              </a:graphicData>
+            </a:graphic>
+          </wp:inline>
+        </w:drawing>
+      </w:r>
+    </w:p>
+    <w:p>
+      <w:pPr>
+        <w:spacing w:after="0" w:line="240" w:lineRule="auto"/>
+        <w:rPr>
+          <w:rFonts w:ascii="Arial Narrow" w:hAnsi="Arial Narrow"/>
+          <w:sz w:val="24"/>
+          <w:szCs w:val="24"/>
+        </w:rPr>
+      </w:pPr>
+    </w:p>
+    <w:p>
+      <w:pPr>
+        <w:spacing w:after="0" w:line="240" w:lineRule="auto"/>
+        <w:rPr>
+          <w:rFonts w:ascii="Arial Narrow" w:hAnsi="Arial Narrow"/>
+          <w:sz w:val="24"/>
+          <w:szCs w:val="24"/>
+        </w:rPr>
+      </w:pPr>
+      <w:r>
+        <w:rPr>
+          <w:noProof/>
+        </w:rPr>
+        <w:lastRenderedPageBreak/>
+        <w:drawing>
+          <wp:inline distT="0" distB="0" distL="0" distR="0" wp14:anchorId="28A48508" wp14:editId="1F9067A5">
+            <wp:extent cx="5731510" cy="1915160"/>
+            <wp:effectExtent l="0" t="0" r="2540" b="8890"/>
+            <wp:docPr id="718893440" name="Picture 6"/>
+            <wp:cNvGraphicFramePr>
+              <a:graphicFrameLocks xmlns:a="http://schemas.openxmlformats.org/drawingml/2006/main" noChangeAspect="1"/>
+            </wp:cNvGraphicFramePr>
+            <a:graphic xmlns:a="http://schemas.openxmlformats.org/drawingml/2006/main">
+              <a:graphicData uri="http://schemas.openxmlformats.org/drawingml/2006/picture">
+                <pic:pic xmlns:pic="http://schemas.openxmlformats.org/drawingml/2006/picture">
+                  <pic:nvPicPr>
+                    <pic:cNvPr id="0" name="Picture 14"/>
+                    <pic:cNvPicPr>
+                      <a:picLocks noChangeAspect="1" noChangeArrowheads="1"/>
+                    </pic:cNvPicPr>
+                  </pic:nvPicPr>
+                  <pic:blipFill>
+                    <a:blip r:embed="rId11">
+                      <a:extLst>
+                        <a:ext uri="{28A0092B-C50C-407E-A947-70E740481C1C}">
+                          <a14:useLocalDpi xmlns:a14="http://schemas.microsoft.com/office/drawing/2010/main" val="0"/>
+                        </a:ext>
+                      </a:extLst>
+                    </a:blip>
+                    <a:srcRect/>
+                    <a:stretch>
+                      <a:fillRect/>
+                    </a:stretch>
+                  </pic:blipFill>
+                  <pic:spPr bwMode="auto">
+                    <a:xfrm>
+                      <a:off x="0" y="0"/>
+                      <a:ext cx="5731510" cy="1915160"/>
+                    </a:xfrm>
+                    <a:prstGeom prst="rect">
+                      <a:avLst/>
+                    </a:prstGeom>
+                    <a:noFill/>
+                    <a:ln>
+                      <a:noFill/>
+                    </a:ln>
+                  </pic:spPr>
+                </pic:pic>
+              </a:graphicData>
+            </a:graphic>
+          </wp:inline>
+        </w:drawing>
+      </w:r>
+    </w:p>
+    <w:p>
+      <w:pPr>
+        <w:pStyle w:val="ListParagraph"/>
+        <w:numPr>
+          <w:ilvl w:val="0"/>
+          <w:numId w:val="1"/>
+        </w:numPr>
+        <w:spacing w:after="0" w:line="240" w:lineRule="auto"/>
+        <w:rPr>
+          <w:rFonts w:ascii="Arial Narrow" w:hAnsi="Arial Narrow"/>
+          <w:sz w:val="24"/>
+          <w:szCs w:val="24"/>
+        </w:rPr>
+      </w:pPr>
+      <w:r>
+        <w:rPr>
+          <w:rFonts w:ascii="Arial Narrow" w:hAnsi="Arial Narrow"/>
+          <w:sz w:val="24"/>
+          <w:szCs w:val="24"/>
+        </w:rPr>
+        <w:t xml:space="preserve">Code </w:t>
+      </w:r>
+      <w:proofErr w:type="spellStart"/>
+      <w:r>
+        <w:rPr>
+          <w:rFonts w:ascii="Arial Narrow" w:hAnsi="Arial Narrow"/>
+          <w:sz w:val="24"/>
+          <w:szCs w:val="24"/>
+        </w:rPr>
+        <w:t>javascript</w:t>
+      </w:r>
+      <w:proofErr w:type="spellEnd"/>
+      <w:r>
+        <w:rPr>
+          <w:rFonts w:ascii="Arial Narrow" w:hAnsi="Arial Narrow"/>
+          <w:sz w:val="24"/>
+          <w:szCs w:val="24"/>
+        </w:rPr>
+        <w:t xml:space="preserve"> yang </w:t>
+      </w:r>
+      <w:proofErr w:type="spellStart"/>
+      <w:r>
+        <w:rPr>
+          <w:rFonts w:ascii="Arial Narrow" w:hAnsi="Arial Narrow"/>
+          <w:sz w:val="24"/>
+          <w:szCs w:val="24"/>
+        </w:rPr>
+        <w:t>dibuat</w:t>
+      </w:r>
+      <w:proofErr w:type="spellEnd"/>
+    </w:p>
+    <w:p>
+      <w:pPr>
+        <w:pStyle w:val="ListParagraph"/>
+        <w:numPr>
+          <w:ilvl w:val="0"/>
+          <w:numId w:val="1"/>
+        </w:numPr>
+        <w:spacing w:after="0" w:line="240" w:lineRule="auto"/>
+        <w:rPr>
+          <w:rFonts w:ascii="Arial Narrow" w:hAnsi="Arial Narrow"/>
+          <w:sz w:val="24"/>
+          <w:szCs w:val="24"/>
+        </w:rPr>
+      </w:pPr>
+      <w:r>
+        <w:rPr>
+          <w:rFonts w:ascii="Arial Narrow" w:hAnsi="Arial Narrow"/>
+          <w:sz w:val="24"/>
+          <w:szCs w:val="24"/>
+        </w:rPr>
+        <w:t xml:space="preserve">Script yang </w:t>
+      </w:r>
+      <w:proofErr w:type="spellStart"/>
+      <w:r>
+        <w:rPr>
+          <w:rFonts w:ascii="Arial Narrow" w:hAnsi="Arial Narrow"/>
+          <w:sz w:val="24"/>
+          <w:szCs w:val="24"/>
+        </w:rPr>
+        <w:t>tersimpan</w:t>
+      </w:r>
+      <w:proofErr w:type="spellEnd"/>
+      <w:r>
+        <w:rPr>
+          <w:rFonts w:ascii="Arial Narrow" w:hAnsi="Arial Narrow"/>
+          <w:sz w:val="24"/>
+          <w:szCs w:val="24"/>
+        </w:rPr>
+        <w:t xml:space="preserve"> </w:t>
+      </w:r>
+      <w:proofErr w:type="spellStart"/>
+      <w:r>
+        <w:rPr>
+          <w:rFonts w:ascii="Arial Narrow" w:hAnsi="Arial Narrow"/>
+          <w:sz w:val="24"/>
+          <w:szCs w:val="24"/>
+        </w:rPr>
+        <w:t>ketika</w:t>
+      </w:r>
+      <w:proofErr w:type="spellEnd"/>
+      <w:r>
+        <w:rPr>
+          <w:rFonts w:ascii="Arial Narrow" w:hAnsi="Arial Narrow"/>
+          <w:sz w:val="24"/>
+          <w:szCs w:val="24"/>
+        </w:rPr>
+        <w:t xml:space="preserve"> </w:t>
+      </w:r>
+      <w:proofErr w:type="spellStart"/>
+      <w:r>
+        <w:rPr>
+          <w:rFonts w:ascii="Arial Narrow" w:hAnsi="Arial Narrow"/>
+          <w:sz w:val="24"/>
+          <w:szCs w:val="24"/>
+        </w:rPr>
+        <w:t>mengaktifkan</w:t>
+      </w:r>
+      <w:proofErr w:type="spellEnd"/>
+      <w:r>
+        <w:rPr>
+          <w:rFonts w:ascii="Arial Narrow" w:hAnsi="Arial Narrow"/>
+          <w:sz w:val="24"/>
+          <w:szCs w:val="24"/>
+        </w:rPr>
+        <w:t xml:space="preserve"> macro </w:t>
+      </w:r>
+      <w:proofErr w:type="spellStart"/>
+      <w:r>
+        <w:rPr>
+          <w:rFonts w:ascii="Arial Narrow" w:hAnsi="Arial Narrow"/>
+          <w:sz w:val="24"/>
+          <w:szCs w:val="24"/>
+        </w:rPr>
+        <w:t>caranya</w:t>
+      </w:r>
+      <w:proofErr w:type="spellEnd"/>
+      <w:r>
+        <w:rPr>
+          <w:rFonts w:ascii="Arial Narrow" w:hAnsi="Arial Narrow"/>
+          <w:sz w:val="24"/>
+          <w:szCs w:val="24"/>
+        </w:rPr>
+        <w:t xml:space="preserve"> </w:t>
+      </w:r>
+      <w:proofErr w:type="spellStart"/>
+      <w:r>
+        <w:rPr>
+          <w:rFonts w:ascii="Arial Narrow" w:hAnsi="Arial Narrow"/>
+          <w:sz w:val="24"/>
+          <w:szCs w:val="24"/>
+        </w:rPr>
+        <w:t>seperti</w:t>
+      </w:r>
+      <w:proofErr w:type="spellEnd"/>
+      <w:r>
+        <w:rPr>
+          <w:rFonts w:ascii="Arial Narrow" w:hAnsi="Arial Narrow"/>
+          <w:sz w:val="24"/>
+          <w:szCs w:val="24"/>
+        </w:rPr>
+        <w:t xml:space="preserve"> </w:t>
+      </w:r>
+      <w:proofErr w:type="spellStart"/>
+      <w:r>
+        <w:rPr>
+          <w:rFonts w:ascii="Arial Narrow" w:hAnsi="Arial Narrow"/>
+          <w:sz w:val="24"/>
+          <w:szCs w:val="24"/>
+        </w:rPr>
+        <w:t>dibawah</w:t>
+      </w:r>
+      <w:proofErr w:type="spellEnd"/>
+      <w:r>
+        <w:rPr>
+          <w:rFonts w:ascii="Arial Narrow" w:hAnsi="Arial Narrow"/>
+          <w:sz w:val="24"/>
+          <w:szCs w:val="24"/>
+        </w:rPr>
+        <w:t>:</w:t>
+      </w:r>
+    </w:p>
+    <w:p>
+      <w:pPr>
+        <w:spacing w:after="0" w:line="240" w:lineRule="auto"/>
+        <w:rPr>
+          <w:rFonts w:ascii="Arial Narrow" w:hAnsi="Arial Narrow"/>
+          <w:sz w:val="24"/>
+          <w:szCs w:val="24"/>
+        </w:rPr>
+      </w:pPr>
+    </w:p>
+    <w:p>
+      <w:pPr>
+        <w:spacing w:after="0" w:line="240" w:lineRule="auto"/>
+        <w:rPr>
+          <w:rFonts w:ascii="Arial Narrow" w:hAnsi="Arial Narrow"/>
+          <w:sz w:val="24"/>
+          <w:szCs w:val="24"/>
+        </w:rPr>
+      </w:pPr>
+      <w:r>
+        <w:rPr>
+          <w:noProof/>
+        </w:rPr>
+        <w:drawing>
+          <wp:inline distT="0" distB="0" distL="0" distR="0" wp14:anchorId="4B4F8D9A" wp14:editId="013F08E3">
+            <wp:extent cx="5731510" cy="1999615"/>
+            <wp:effectExtent l="0" t="0" r="2540" b="635"/>
+            <wp:docPr id="2014668497" name="Picture 8"/>
+            <wp:cNvGraphicFramePr>
+              <a:graphicFrameLocks xmlns:a="http://schemas.openxmlformats.org/drawingml/2006/main" noChangeAspect="1"/>
+            </wp:cNvGraphicFramePr>
+            <a:graphic xmlns:a="http://schemas.openxmlformats.org/drawingml/2006/main">
+              <a:graphicData uri="http://schemas.openxmlformats.org/drawingml/2006/picture">
+                <pic:pic xmlns:pic="http://schemas.openxmlformats.org/drawingml/2006/picture">
+                  <pic:nvPicPr>
+                    <pic:cNvPr id="0" name="Picture 21"/>
+                    <pic:cNvPicPr>
+                      <a:picLocks noChangeAspect="1" noChangeArrowheads="1"/>
+                    </pic:cNvPicPr>
+                  </pic:nvPicPr>
+                  <pic:blipFill>
+                    <a:blip r:embed="rId12">
+                      <a:extLst>
+                        <a:ext uri="{28A0092B-C50C-407E-A947-70E740481C1C}">
+                          <a14:useLocalDpi xmlns:a14="http://schemas.microsoft.com/office/drawing/2010/main" val="0"/>
+                        </a:ext>
+                      </a:extLst>
+                    </a:blip>
+                    <a:srcRect/>
+                    <a:stretch>
+                      <a:fillRect/>
+                    </a:stretch>
+                  </pic:blipFill>
+                  <pic:spPr bwMode="auto">
+                    <a:xfrm>
+                      <a:off x="0" y="0"/>
+                      <a:ext cx="5731510" cy="1999615"/>
+                    </a:xfrm>
+                    <a:prstGeom prst="rect">
+                      <a:avLst/>
+                    </a:prstGeom>
+                    <a:noFill/>
+                    <a:ln>
+                      <a:noFill/>
+                    </a:ln>
+                  </pic:spPr>
+                </pic:pic>
+              </a:graphicData>
+            </a:graphic>
+          </wp:inline>
+        </w:drawing>
+      </w:r>
+    </w:p>
+    <w:p>
+      <w:pPr>
+        <w:spacing w:after="0" w:line="240" w:lineRule="auto"/>
+        <w:rPr>
+          <w:rFonts w:ascii="Arial Narrow" w:hAnsi="Arial Narrow"/>
+          <w:sz w:val="24"/>
+          <w:szCs w:val="24"/>
+        </w:rPr>
+      </w:pPr>
+    </w:p>
+    <w:p>
+      <w:pPr>
+        <w:spacing w:after="0" w:line="240" w:lineRule="auto"/>
+        <w:rPr>
+          <w:rFonts w:ascii="Arial Narrow" w:hAnsi="Arial Narrow"/>
+          <w:sz w:val="24"/>
+          <w:szCs w:val="24"/>
+        </w:rPr>
+      </w:pPr>
+      <w:r>
+        <w:rPr>
+          <w:noProof/>
+        </w:rPr>
+        <w:drawing>
+          <wp:inline distT="0" distB="0" distL="0" distR="0" wp14:anchorId="5B7FDC91" wp14:editId="76232939">
+            <wp:extent cx="5731510" cy="3063875"/>
+            <wp:effectExtent l="0" t="0" r="2540" b="3175"/>
+            <wp:docPr id="2098276788" name="Picture 10"/>
+            <wp:cNvGraphicFramePr>
+              <a:graphicFrameLocks xmlns:a="http://schemas.openxmlformats.org/drawingml/2006/main" noChangeAspect="1"/>
+            </wp:cNvGraphicFramePr>
+            <a:graphic xmlns:a="http://schemas.openxmlformats.org/drawingml/2006/main">
+              <a:graphicData uri="http://schemas.openxmlformats.org/drawingml/2006/picture">
+                <pic:pic xmlns:pic="http://schemas.openxmlformats.org/drawingml/2006/picture">
+                  <pic:nvPicPr>
+                    <pic:cNvPr id="0" name="Picture 25"/>
+                    <pic:cNvPicPr>
+                      <a:picLocks noChangeAspect="1" noChangeArrowheads="1"/>
+                    </pic:cNvPicPr>
+                  </pic:nvPicPr>
+                  <pic:blipFill>
+                    <a:blip r:embed="rId13">
+                      <a:extLst>
+                        <a:ext uri="{28A0092B-C50C-407E-A947-70E740481C1C}">
+                          <a14:useLocalDpi xmlns:a14="http://schemas.microsoft.com/office/drawing/2010/main" val="0"/>
+                        </a:ext>
+                      </a:extLst>
+                    </a:blip>
+                    <a:srcRect/>
+                    <a:stretch>
+                      <a:fillRect/>
+                    </a:stretch>
+                  </pic:blipFill>
+                  <pic:spPr bwMode="auto">
+                    <a:xfrm>
+                      <a:off x="0" y="0"/>
+                      <a:ext cx="5731510" cy="3063875"/>
+                    </a:xfrm>
+                    <a:prstGeom prst="rect">
+                      <a:avLst/>
+                    </a:prstGeom>
+                    <a:noFill/>
+                    <a:ln>
+                      <a:noFill/>
+                    </a:ln>
+                  </pic:spPr>
+                </pic:pic>
+              </a:graphicData>
+            </a:graphic>
+          </wp:inline>
+        </w:drawing>
+      </w:r>
+    </w:p>
+    <w:p>
+      <w:pPr>
+        <w:spacing w:after="0" w:line="240" w:lineRule="auto"/>
+        <w:rPr>
+          <w:rFonts w:ascii="Arial Narrow" w:hAnsi="Arial Narrow"/>
+          <w:sz w:val="24"/>
+          <w:szCs w:val="24"/>
+        </w:rPr>
+      </w:pPr>
+      <w:r>
+        <w:rPr>
+          <w:rFonts w:ascii="Arial Narrow" w:hAnsi="Arial Narrow"/>
+          <w:sz w:val="24"/>
+          <w:szCs w:val="24"/>
+        </w:rPr>
+        <w:lastRenderedPageBreak/>
+        <w:drawing>
+          <wp:inline distT="0" distB="0" distL="0" distR="0" wp14:anchorId="51260039" wp14:editId="39E37747">
+            <wp:extent cx="2347163" cy="2270957"/>
+            <wp:effectExtent l="0" t="0" r="0" b="0"/>
+            <wp:docPr id="747453632" name="Picture 1"/>
+            <wp:cNvGraphicFramePr>
+              <a:graphicFrameLocks xmlns:a="http://schemas.openxmlformats.org/drawingml/2006/main" noChangeAspect="1"/>
+            </wp:cNvGraphicFramePr>
+            <a:graphic xmlns:a="http://schemas.openxmlformats.org/drawingml/2006/main">
+              <a:graphicData uri="http://schemas.openxmlformats.org/drawingml/2006/picture">
+                <pic:pic xmlns:pic="http://schemas.openxmlformats.org/drawingml/2006/picture">
+                  <pic:nvPicPr>
+                    <pic:cNvPr id="747453632" name=""/>
+                    <pic:cNvPicPr/>
+                  </pic:nvPicPr>
+                  <pic:blipFill>
+                    <a:blip r:embed="rId14"/>
+                    <a:stretch>
+                      <a:fillRect/>
+                    </a:stretch>
+                  </pic:blipFill>
+                  <pic:spPr>
+                    <a:xfrm>
+                      <a:off x="0" y="0"/>
+                      <a:ext cx="2347163" cy="2270957"/>
+                    </a:xfrm>
+                    <a:prstGeom prst="rect">
+                      <a:avLst/>
+                    </a:prstGeom>
+                  </pic:spPr>
+                </pic:pic>
+              </a:graphicData>
+            </a:graphic>
+          </wp:inline>
+        </w:drawing>
+      </w:r>
+    </w:p>
+    <w:p>
+      <w:pPr>
+        <w:spacing w:after="0" w:line="240" w:lineRule="auto"/>
+        <w:rPr>
+          <w:rFonts w:ascii="Arial Narrow" w:hAnsi="Arial Narrow"/>
+          <w:sz w:val="24"/>
+          <w:szCs w:val="24"/>
+        </w:rPr>
+      </w:pPr>
+    </w:p>
+    <w:p>
+      <w:pPr>
+        <w:spacing w:after="0" w:line="240" w:lineRule="auto"/>
+        <w:rPr>
+          <w:rFonts w:ascii="Arial Narrow" w:hAnsi="Arial Narrow"/>
+          <w:sz w:val="24"/>
+          <w:szCs w:val="24"/>
+        </w:rPr>
+      </w:pPr>
+      <w:r>
+        <w:rPr>
+          <w:rFonts w:ascii="Arial Narrow" w:hAnsi="Arial Narrow"/>
+          <w:sz w:val="24"/>
+          <w:szCs w:val="24"/>
+        </w:rPr>
+        <w:t xml:space="preserve">Function di </w:t>
+      </w:r>
+      <w:proofErr w:type="spellStart"/>
+      <w:r>
+        <w:rPr>
+          <w:rFonts w:ascii="Arial Narrow" w:hAnsi="Arial Narrow"/>
+          <w:sz w:val="24"/>
+          <w:szCs w:val="24"/>
+        </w:rPr>
+        <w:t>appscript</w:t>
+      </w:r>
+      <w:proofErr w:type="spellEnd"/>
+      <w:r>
+        <w:rPr>
+          <w:rFonts w:ascii="Arial Narrow" w:hAnsi="Arial Narrow"/>
+          <w:sz w:val="24"/>
+          <w:szCs w:val="24"/>
+        </w:rPr>
+        <w:t>:</w:t>
+      </w:r>
+    </w:p>
+    <w:p>
+      <w:pPr>
+        <w:spacing w:after="0" w:line="240" w:lineRule="auto"/>
+        <w:rPr>
+          <w:rFonts w:ascii="Arial Narrow" w:hAnsi="Arial Narrow"/>
+          <w:sz w:val="24"/>
+          <w:szCs w:val="24"/>
+        </w:rPr>
+      </w:pPr>
+      <w:r>
+        <w:rPr>
+          <w:noProof/>
+        </w:rPr>
+        <w:drawing>
+          <wp:inline distT="0" distB="0" distL="0" distR="0" wp14:anchorId="0B79827D" wp14:editId="66CFF46B">
+            <wp:extent cx="5731510" cy="2136140"/>
+            <wp:effectExtent l="0" t="0" r="2540" b="0"/>
+            <wp:docPr id="607899949" name="Picture 9"/>
+            <wp:cNvGraphicFramePr>
+              <a:graphicFrameLocks xmlns:a="http://schemas.openxmlformats.org/drawingml/2006/main" noChangeAspect="1"/>
+            </wp:cNvGraphicFramePr>
+            <a:graphic xmlns:a="http://schemas.openxmlformats.org/drawingml/2006/main">
+              <a:graphicData uri="http://schemas.openxmlformats.org/drawingml/2006/picture">
+                <pic:pic xmlns:pic="http://schemas.openxmlformats.org/drawingml/2006/picture">
+                  <pic:nvPicPr>
+                    <pic:cNvPr id="0" name="Picture 23"/>
+                    <pic:cNvPicPr>
+                      <a:picLocks noChangeAspect="1" noChangeArrowheads="1"/>
+                    </pic:cNvPicPr>
+                  </pic:nvPicPr>
+                  <pic:blipFill>
+                    <a:blip r:embed="rId15">
+                      <a:extLst>
+                        <a:ext uri="{28A0092B-C50C-407E-A947-70E740481C1C}">
+                          <a14:useLocalDpi xmlns:a14="http://schemas.microsoft.com/office/drawing/2010/main" val="0"/>
+                        </a:ext>
+                      </a:extLst>
+                    </a:blip>
+                    <a:srcRect/>
+                    <a:stretch>
+                      <a:fillRect/>
+                    </a:stretch>
+                  </pic:blipFill>
+                  <pic:spPr bwMode="auto">
+                    <a:xfrm>
+                      <a:off x="0" y="0"/>
+                      <a:ext cx="5731510" cy="2136140"/>
+                    </a:xfrm>
+                    <a:prstGeom prst="rect">
+                      <a:avLst/>
+                    </a:prstGeom>
+                    <a:noFill/>
+                    <a:ln>
+                      <a:noFill/>
+                    </a:ln>
+                  </pic:spPr>
+                </pic:pic>
+              </a:graphicData>
+            </a:graphic>
+          </wp:inline>
+        </w:drawing>
+      </w:r>
+    </w:p>
+    <w:p>
+      <w:pPr>
+        <w:spacing w:after="0" w:line="240" w:lineRule="auto"/>
+        <w:rPr>
+          <w:rFonts w:ascii="Arial Narrow" w:hAnsi="Arial Narrow"/>
+          <w:sz w:val="24"/>
+          <w:szCs w:val="24"/>
+        </w:rPr>
+      </w:pPr>
+    </w:p>
+    <w:p>
+      <w:pPr>
+        <w:spacing w:after="0" w:line="240" w:lineRule="auto"/>
+        <w:rPr>
+          <w:rFonts w:ascii="Arial Narrow" w:hAnsi="Arial Narrow"/>
+          <w:sz w:val="24"/>
+          <w:szCs w:val="24"/>
+        </w:rPr>
+      </w:pPr>
+      <w:r>
+        <w:rPr>
+          <w:rFonts w:ascii="Arial Narrow" w:hAnsi="Arial Narrow"/>
+          <w:sz w:val="24"/>
+          <w:szCs w:val="24"/>
+        </w:rPr>
+        <w:drawing>
+          <wp:inline distT="0" distB="0" distL="0" distR="0" wp14:anchorId="0994DCFA" wp14:editId="2EEE1134">
+            <wp:extent cx="5044877" cy="2651990"/>
+            <wp:effectExtent l="0" t="0" r="3810" b="0"/>
+            <wp:docPr id="566244353" name="Picture 1"/>
+            <wp:cNvGraphicFramePr>
+              <a:graphicFrameLocks xmlns:a="http://schemas.openxmlformats.org/drawingml/2006/main" noChangeAspect="1"/>
+            </wp:cNvGraphicFramePr>
+            <a:graphic xmlns:a="http://schemas.openxmlformats.org/drawingml/2006/main">
+              <a:graphicData uri="http://schemas.openxmlformats.org/drawingml/2006/picture">
+                <pic:pic xmlns:pic="http://schemas.openxmlformats.org/drawingml/2006/picture">
+                  <pic:nvPicPr>
+                    <pic:cNvPr id="566244353" name=""/>
+                    <pic:cNvPicPr/>
+                  </pic:nvPicPr>
+                  <pic:blipFill>
+                    <a:blip r:embed="rId16"/>
+                    <a:stretch>
+                      <a:fillRect/>
+                    </a:stretch>
+                  </pic:blipFill>
+                  <pic:spPr>
+                    <a:xfrm>
+                      <a:off x="0" y="0"/>
+                      <a:ext cx="5044877" cy="2651990"/>
+                    </a:xfrm>
+                    <a:prstGeom prst="rect">
+                      <a:avLst/>
+                    </a:prstGeom>
+                  </pic:spPr>
+                </pic:pic>
+              </a:graphicData>
+            </a:graphic>
+          </wp:inline>
+        </w:drawing>
+      </w:r>
+    </w:p>
+    <w:p>
+      <w:pPr>
+        <w:spacing w:after="0" w:line="240" w:lineRule="auto"/>
+        <w:rPr>
+          <w:rFonts w:ascii="Arial Narrow" w:hAnsi="Arial Narrow"/>
+          <w:sz w:val="24"/>
+          <w:szCs w:val="24"/>
+        </w:rPr>
+      </w:pPr>
+      <w:r>
+        <w:rPr>
+          <w:rFonts w:ascii="Arial Narrow" w:hAnsi="Arial Narrow"/>
+          <w:sz w:val="24"/>
+          <w:szCs w:val="24"/>
+        </w:rPr>
+        <w:t>Data in spreadsheet when remove from there, after click run so data appear there in spreadsheet</w:t>
+      </w:r>
+    </w:p>
+    <w:p>
+      <w:pPr>
+        <w:spacing w:after="0" w:line="240" w:lineRule="auto"/>
+        <w:rPr>
+          <w:rFonts w:ascii="Arial Narrow" w:hAnsi="Arial Narrow"/>
+          <w:sz w:val="24"/>
+          <w:szCs w:val="24"/>
+        </w:rPr>
+      </w:pPr>
+      <w:r>
+        <w:rPr>
+          <w:noProof/>
+        </w:rPr>
+        <w:lastRenderedPageBreak/>
+        <w:drawing>
+          <wp:inline distT="0" distB="0" distL="0" distR="0" wp14:anchorId="702A327B" wp14:editId="1F79ECB0">
+            <wp:extent cx="5731510" cy="2356485"/>
+            <wp:effectExtent l="0" t="0" r="2540" b="5715"/>
+            <wp:docPr id="1292731121" name="Picture 11"/>
+            <wp:cNvGraphicFramePr>
+              <a:graphicFrameLocks xmlns:a="http://schemas.openxmlformats.org/drawingml/2006/main" noChangeAspect="1"/>
+            </wp:cNvGraphicFramePr>
+            <a:graphic xmlns:a="http://schemas.openxmlformats.org/drawingml/2006/main">
+              <a:graphicData uri="http://schemas.openxmlformats.org/drawingml/2006/picture">
+                <pic:pic xmlns:pic="http://schemas.openxmlformats.org/drawingml/2006/picture">
+                  <pic:nvPicPr>
+                    <pic:cNvPr id="0" name="Picture 27"/>
+                    <pic:cNvPicPr>
+                      <a:picLocks noChangeAspect="1" noChangeArrowheads="1"/>
+                    </pic:cNvPicPr>
+                  </pic:nvPicPr>
+                  <pic:blipFill>
+                    <a:blip r:embed="rId17">
+                      <a:extLst>
+                        <a:ext uri="{28A0092B-C50C-407E-A947-70E740481C1C}">
+                          <a14:useLocalDpi xmlns:a14="http://schemas.microsoft.com/office/drawing/2010/main" val="0"/>
+                        </a:ext>
+                      </a:extLst>
+                    </a:blip>
+                    <a:srcRect/>
+                    <a:stretch>
+                      <a:fillRect/>
+                    </a:stretch>
+                  </pic:blipFill>
+                  <pic:spPr bwMode="auto">
+                    <a:xfrm>
+                      <a:off x="0" y="0"/>
+                      <a:ext cx="5731510" cy="2356485"/>
+                    </a:xfrm>
+                    <a:prstGeom prst="rect">
+                      <a:avLst/>
+                    </a:prstGeom>
+                    <a:noFill/>
+                    <a:ln>
+                      <a:noFill/>
+                    </a:ln>
+                  </pic:spPr>
+                </pic:pic>
+              </a:graphicData>
+            </a:graphic>
+          </wp:inline>
+        </w:drawing>
+      </w:r>
+    </w:p>
+    <w:p>
+      <w:pPr>
+        <w:spacing w:after="0" w:line="240" w:lineRule="auto"/>
+        <w:rPr>
+          <w:rFonts w:ascii="Arial Narrow" w:hAnsi="Arial Narrow"/>
+          <w:sz w:val="24"/>
+          <w:szCs w:val="24"/>
+        </w:rPr>
+      </w:pPr>
+      <w:r>
+        <w:rPr>
+          <w:rFonts w:ascii="Arial Narrow" w:hAnsi="Arial Narrow"/>
+          <w:sz w:val="24"/>
+          <w:szCs w:val="24"/>
+        </w:rPr>
+        <w:t xml:space="preserve">To see documentation in google apps script: </w:t>
+      </w:r>
+      <w:hyperlink r:id="rId18" w:history="1">
+        <w:r>
+          <w:rPr>
+            <w:rStyle w:val="Hyperlink"/>
+            <w:rFonts w:ascii="Arial Narrow" w:hAnsi="Arial Narrow"/>
+            <w:sz w:val="24"/>
+            <w:szCs w:val="24"/>
+          </w:rPr>
+          <w:t>https://developers.google.com/apps-script/reference?hl=en</w:t>
+        </w:r>
+      </w:hyperlink>
+      <w:r>
+        <w:rPr>
+          <w:rFonts w:ascii="Arial Narrow" w:hAnsi="Arial Narrow"/>
+          <w:sz w:val="24"/>
+          <w:szCs w:val="24"/>
+        </w:rPr>
+        <w:t xml:space="preserve"> </w:t>
+      </w:r>
+    </w:p>
+    <w:p>
+      <w:pPr>
+        <w:spacing w:after="0" w:line="240" w:lineRule="auto"/>
+        <w:rPr>
+          <w:rFonts w:ascii="Arial Narrow" w:hAnsi="Arial Narrow"/>
+          <w:sz w:val="24"/>
+          <w:szCs w:val="24"/>
+        </w:rPr>
+      </w:pPr>
+    </w:p>
+    <w:p>
+      <w:pPr>
+        <w:spacing w:after="0" w:line="240" w:lineRule="auto"/>
+        <w:rPr>
+          <w:rFonts w:ascii="Arial Narrow" w:hAnsi="Arial Narrow"/>
+          <w:sz w:val="24"/>
+          <w:szCs w:val="24"/>
+        </w:rPr>
+      </w:pPr>
+      <w:proofErr w:type="spellStart"/>
+      <w:r>
+        <w:rPr>
+          <w:rFonts w:ascii="Arial Narrow" w:hAnsi="Arial Narrow"/>
+          <w:sz w:val="24"/>
+          <w:szCs w:val="24"/>
+        </w:rPr>
+        <w:t>Penjelasan</w:t>
+      </w:r>
+      <w:proofErr w:type="spellEnd"/>
+      <w:r>
+        <w:rPr>
+          <w:rFonts w:ascii="Arial Narrow" w:hAnsi="Arial Narrow"/>
+          <w:sz w:val="24"/>
+          <w:szCs w:val="24"/>
+        </w:rPr>
+        <w:t xml:space="preserve"> every script:</w:t>
+      </w:r>
+    </w:p>
+    <w:p>
+      <w:pPr>
+        <w:spacing w:after="0" w:line="240" w:lineRule="auto"/>
+        <w:rPr>
+          <w:rFonts w:ascii="Arial Narrow" w:hAnsi="Arial Narrow"/>
+          <w:sz w:val="24"/>
+          <w:szCs w:val="24"/>
+        </w:rPr>
+      </w:pPr>
+      <w:proofErr w:type="spellStart"/>
+      <w:r>
+        <w:rPr>
+          <w:rFonts w:ascii="Arial Narrow" w:hAnsi="Arial Narrow"/>
+          <w:sz w:val="24"/>
+          <w:szCs w:val="24"/>
+        </w:rPr>
+        <w:t>Fungsi</w:t>
+      </w:r>
+      <w:proofErr w:type="spellEnd"/>
+      <w:r>
+        <w:rPr>
+          <w:rFonts w:ascii="Arial Narrow" w:hAnsi="Arial Narrow"/>
+          <w:sz w:val="24"/>
+          <w:szCs w:val="24"/>
+        </w:rPr>
+        <w:t xml:space="preserve"> latihan_1() di </w:t>
+      </w:r>
+      <w:proofErr w:type="spellStart"/>
+      <w:r>
+        <w:rPr>
+          <w:rFonts w:ascii="Arial Narrow" w:hAnsi="Arial Narrow"/>
+          <w:sz w:val="24"/>
+          <w:szCs w:val="24"/>
+        </w:rPr>
+        <w:t>atas</w:t>
+      </w:r>
+      <w:proofErr w:type="spellEnd"/>
+      <w:r>
+        <w:rPr>
+          <w:rFonts w:ascii="Arial Narrow" w:hAnsi="Arial Narrow"/>
+          <w:sz w:val="24"/>
+          <w:szCs w:val="24"/>
+        </w:rPr>
+        <w:t xml:space="preserve"> </w:t>
+      </w:r>
+      <w:proofErr w:type="spellStart"/>
+      <w:r>
+        <w:rPr>
+          <w:rFonts w:ascii="Arial Narrow" w:hAnsi="Arial Narrow"/>
+          <w:sz w:val="24"/>
+          <w:szCs w:val="24"/>
+        </w:rPr>
+        <w:t>adalah</w:t>
+      </w:r>
+      <w:proofErr w:type="spellEnd"/>
+      <w:r>
+        <w:rPr>
+          <w:rFonts w:ascii="Arial Narrow" w:hAnsi="Arial Narrow"/>
+          <w:sz w:val="24"/>
+          <w:szCs w:val="24"/>
+        </w:rPr>
+        <w:t xml:space="preserve"> </w:t>
+      </w:r>
+      <w:proofErr w:type="spellStart"/>
+      <w:r>
+        <w:rPr>
+          <w:rFonts w:ascii="Arial Narrow" w:hAnsi="Arial Narrow"/>
+          <w:sz w:val="24"/>
+          <w:szCs w:val="24"/>
+        </w:rPr>
+        <w:t>skrip</w:t>
+      </w:r>
+      <w:proofErr w:type="spellEnd"/>
+      <w:r>
+        <w:rPr>
+          <w:rFonts w:ascii="Arial Narrow" w:hAnsi="Arial Narrow"/>
+          <w:sz w:val="24"/>
+          <w:szCs w:val="24"/>
+        </w:rPr>
+        <w:t xml:space="preserve"> Google Apps Script yang </w:t>
+      </w:r>
+      <w:proofErr w:type="spellStart"/>
+      <w:r>
+        <w:rPr>
+          <w:rFonts w:ascii="Arial Narrow" w:hAnsi="Arial Narrow"/>
+          <w:sz w:val="24"/>
+          <w:szCs w:val="24"/>
+        </w:rPr>
+        <w:t>berfungsi</w:t>
+      </w:r>
+      <w:proofErr w:type="spellEnd"/>
+      <w:r>
+        <w:rPr>
+          <w:rFonts w:ascii="Arial Narrow" w:hAnsi="Arial Narrow"/>
+          <w:sz w:val="24"/>
+          <w:szCs w:val="24"/>
+        </w:rPr>
+        <w:t xml:space="preserve"> </w:t>
+      </w:r>
+      <w:proofErr w:type="spellStart"/>
+      <w:r>
+        <w:rPr>
+          <w:rFonts w:ascii="Arial Narrow" w:hAnsi="Arial Narrow"/>
+          <w:sz w:val="24"/>
+          <w:szCs w:val="24"/>
+        </w:rPr>
+        <w:t>untuk</w:t>
+      </w:r>
+      <w:proofErr w:type="spellEnd"/>
+      <w:r>
+        <w:rPr>
+          <w:rFonts w:ascii="Arial Narrow" w:hAnsi="Arial Narrow"/>
+          <w:sz w:val="24"/>
+          <w:szCs w:val="24"/>
+        </w:rPr>
+        <w:t xml:space="preserve"> </w:t>
+      </w:r>
+      <w:proofErr w:type="spellStart"/>
+      <w:r>
+        <w:rPr>
+          <w:rFonts w:ascii="Arial Narrow" w:hAnsi="Arial Narrow"/>
+          <w:sz w:val="24"/>
+          <w:szCs w:val="24"/>
+        </w:rPr>
+        <w:t>membuat</w:t>
+      </w:r>
+      <w:proofErr w:type="spellEnd"/>
+      <w:r>
+        <w:rPr>
+          <w:rFonts w:ascii="Arial Narrow" w:hAnsi="Arial Narrow"/>
+          <w:sz w:val="24"/>
+          <w:szCs w:val="24"/>
+        </w:rPr>
+        <w:t xml:space="preserve"> dan </w:t>
+      </w:r>
+      <w:proofErr w:type="spellStart"/>
+      <w:r>
+        <w:rPr>
+          <w:rFonts w:ascii="Arial Narrow" w:hAnsi="Arial Narrow"/>
+          <w:sz w:val="24"/>
+          <w:szCs w:val="24"/>
+        </w:rPr>
+        <w:t>mengisi</w:t>
+      </w:r>
+      <w:proofErr w:type="spellEnd"/>
+      <w:r>
+        <w:rPr>
+          <w:rFonts w:ascii="Arial Narrow" w:hAnsi="Arial Narrow"/>
+          <w:sz w:val="24"/>
+          <w:szCs w:val="24"/>
+        </w:rPr>
+        <w:t xml:space="preserve"> </w:t>
+      </w:r>
+      <w:proofErr w:type="spellStart"/>
+      <w:r>
+        <w:rPr>
+          <w:rFonts w:ascii="Arial Narrow" w:hAnsi="Arial Narrow"/>
+          <w:sz w:val="24"/>
+          <w:szCs w:val="24"/>
+        </w:rPr>
+        <w:t>tabel</w:t>
+      </w:r>
+      <w:proofErr w:type="spellEnd"/>
+      <w:r>
+        <w:rPr>
+          <w:rFonts w:ascii="Arial Narrow" w:hAnsi="Arial Narrow"/>
+          <w:sz w:val="24"/>
+          <w:szCs w:val="24"/>
+        </w:rPr>
+        <w:t xml:space="preserve"> data </w:t>
+      </w:r>
+      <w:proofErr w:type="spellStart"/>
+      <w:r>
+        <w:rPr>
+          <w:rFonts w:ascii="Arial Narrow" w:hAnsi="Arial Narrow"/>
+          <w:sz w:val="24"/>
+          <w:szCs w:val="24"/>
+        </w:rPr>
+        <w:t>absensi</w:t>
+      </w:r>
+      <w:proofErr w:type="spellEnd"/>
+      <w:r>
+        <w:rPr>
+          <w:rFonts w:ascii="Arial Narrow" w:hAnsi="Arial Narrow"/>
+          <w:sz w:val="24"/>
+          <w:szCs w:val="24"/>
+        </w:rPr>
+        <w:t xml:space="preserve"> </w:t>
+      </w:r>
+      <w:proofErr w:type="spellStart"/>
+      <w:r>
+        <w:rPr>
+          <w:rFonts w:ascii="Arial Narrow" w:hAnsi="Arial Narrow"/>
+          <w:sz w:val="24"/>
+          <w:szCs w:val="24"/>
+        </w:rPr>
+        <w:t>secara</w:t>
+      </w:r>
+      <w:proofErr w:type="spellEnd"/>
+      <w:r>
+        <w:rPr>
+          <w:rFonts w:ascii="Arial Narrow" w:hAnsi="Arial Narrow"/>
+          <w:sz w:val="24"/>
+          <w:szCs w:val="24"/>
+        </w:rPr>
+        <w:t xml:space="preserve"> </w:t>
+      </w:r>
+      <w:proofErr w:type="spellStart"/>
+      <w:r>
+        <w:rPr>
+          <w:rFonts w:ascii="Arial Narrow" w:hAnsi="Arial Narrow"/>
+          <w:sz w:val="24"/>
+          <w:szCs w:val="24"/>
+        </w:rPr>
+        <w:t>otomatis</w:t>
+      </w:r>
+      <w:proofErr w:type="spellEnd"/>
+      <w:r>
+        <w:rPr>
+          <w:rFonts w:ascii="Arial Narrow" w:hAnsi="Arial Narrow"/>
+          <w:sz w:val="24"/>
+          <w:szCs w:val="24"/>
+        </w:rPr>
+        <w:t xml:space="preserve"> di </w:t>
+      </w:r>
+      <w:proofErr w:type="spellStart"/>
+      <w:r>
+        <w:rPr>
+          <w:rFonts w:ascii="Arial Narrow" w:hAnsi="Arial Narrow"/>
+          <w:sz w:val="24"/>
+          <w:szCs w:val="24"/>
+        </w:rPr>
+        <w:t>dalam</w:t>
+      </w:r>
+      <w:proofErr w:type="spellEnd"/>
+      <w:r>
+        <w:rPr>
+          <w:rFonts w:ascii="Arial Narrow" w:hAnsi="Arial Narrow"/>
+          <w:sz w:val="24"/>
+          <w:szCs w:val="24"/>
+        </w:rPr>
+        <w:t xml:space="preserve"> </w:t>
+      </w:r>
+      <w:proofErr w:type="spellStart"/>
+      <w:r>
+        <w:rPr>
+          <w:rFonts w:ascii="Arial Narrow" w:hAnsi="Arial Narrow"/>
+          <w:sz w:val="24"/>
+          <w:szCs w:val="24"/>
+        </w:rPr>
+        <w:t>lembar</w:t>
+      </w:r>
+      <w:proofErr w:type="spellEnd"/>
+      <w:r>
+        <w:rPr>
+          <w:rFonts w:ascii="Arial Narrow" w:hAnsi="Arial Narrow"/>
+          <w:sz w:val="24"/>
+          <w:szCs w:val="24"/>
+        </w:rPr>
+        <w:t xml:space="preserve"> </w:t>
+      </w:r>
+      <w:proofErr w:type="spellStart"/>
+      <w:r>
+        <w:rPr>
+          <w:rFonts w:ascii="Arial Narrow" w:hAnsi="Arial Narrow"/>
+          <w:sz w:val="24"/>
+          <w:szCs w:val="24"/>
+        </w:rPr>
+        <w:t>kerja</w:t>
+      </w:r>
+      <w:proofErr w:type="spellEnd"/>
+      <w:r>
+        <w:rPr>
+          <w:rFonts w:ascii="Arial Narrow" w:hAnsi="Arial Narrow"/>
+          <w:sz w:val="24"/>
+          <w:szCs w:val="24"/>
+        </w:rPr>
+        <w:t xml:space="preserve"> (spreadsheet) Google Sheets yang </w:t>
+      </w:r>
+      <w:proofErr w:type="spellStart"/>
+      <w:r>
+        <w:rPr>
+          <w:rFonts w:ascii="Arial Narrow" w:hAnsi="Arial Narrow"/>
+          <w:sz w:val="24"/>
+          <w:szCs w:val="24"/>
+        </w:rPr>
+        <w:t>sedang</w:t>
+      </w:r>
+      <w:proofErr w:type="spellEnd"/>
+      <w:r>
+        <w:rPr>
+          <w:rFonts w:ascii="Arial Narrow" w:hAnsi="Arial Narrow"/>
+          <w:sz w:val="24"/>
+          <w:szCs w:val="24"/>
+        </w:rPr>
+        <w:t xml:space="preserve"> </w:t>
+      </w:r>
+      <w:proofErr w:type="spellStart"/>
+      <w:r>
+        <w:rPr>
+          <w:rFonts w:ascii="Arial Narrow" w:hAnsi="Arial Narrow"/>
+          <w:sz w:val="24"/>
+          <w:szCs w:val="24"/>
+        </w:rPr>
+        <w:t>aktif</w:t>
+      </w:r>
+      <w:proofErr w:type="spellEnd"/>
+      <w:r>
+        <w:rPr>
+          <w:rFonts w:ascii="Arial Narrow" w:hAnsi="Arial Narrow"/>
+          <w:sz w:val="24"/>
+          <w:szCs w:val="24"/>
+        </w:rPr>
+        <w:t>.</w:t>
+      </w:r>
+    </w:p>
+    <w:p>
+      <w:pPr>
+        <w:spacing w:after="0" w:line="240" w:lineRule="auto"/>
+        <w:rPr>
+          <w:rFonts w:ascii="Arial Narrow" w:hAnsi="Arial Narrow"/>
+          <w:sz w:val="24"/>
+          <w:szCs w:val="24"/>
+        </w:rPr>
+      </w:pPr>
+    </w:p>
+    <w:p>
+      <w:pPr>
+        <w:spacing w:after="0" w:line="240" w:lineRule="auto"/>
+        <w:rPr>
+          <w:rFonts w:ascii="Arial Narrow" w:hAnsi="Arial Narrow"/>
+          <w:sz w:val="24"/>
+          <w:szCs w:val="24"/>
+        </w:rPr>
+      </w:pPr>
+      <w:proofErr w:type="spellStart"/>
+      <w:r>
+        <w:rPr>
+          <w:rFonts w:ascii="Arial Narrow" w:hAnsi="Arial Narrow"/>
+          <w:sz w:val="24"/>
+          <w:szCs w:val="24"/>
+        </w:rPr>
+        <w:t>Berikut</w:t>
+      </w:r>
+      <w:proofErr w:type="spellEnd"/>
+      <w:r>
+        <w:rPr>
+          <w:rFonts w:ascii="Arial Narrow" w:hAnsi="Arial Narrow"/>
+          <w:sz w:val="24"/>
+          <w:szCs w:val="24"/>
+        </w:rPr>
+        <w:t xml:space="preserve"> </w:t>
+      </w:r>
+      <w:proofErr w:type="spellStart"/>
+      <w:r>
+        <w:rPr>
+          <w:rFonts w:ascii="Arial Narrow" w:hAnsi="Arial Narrow"/>
+          <w:sz w:val="24"/>
+          <w:szCs w:val="24"/>
+        </w:rPr>
+        <w:t>adalah</w:t>
+      </w:r>
+      <w:proofErr w:type="spellEnd"/>
+      <w:r>
+        <w:rPr>
+          <w:rFonts w:ascii="Arial Narrow" w:hAnsi="Arial Narrow"/>
+          <w:sz w:val="24"/>
+          <w:szCs w:val="24"/>
+        </w:rPr>
+        <w:t xml:space="preserve"> </w:t>
+      </w:r>
+      <w:proofErr w:type="spellStart"/>
+      <w:r>
+        <w:rPr>
+          <w:rFonts w:ascii="Arial Narrow" w:hAnsi="Arial Narrow"/>
+          <w:sz w:val="24"/>
+          <w:szCs w:val="24"/>
+        </w:rPr>
+        <w:t>rincian</w:t>
+      </w:r>
+      <w:proofErr w:type="spellEnd"/>
+      <w:r>
+        <w:rPr>
+          <w:rFonts w:ascii="Arial Narrow" w:hAnsi="Arial Narrow"/>
+          <w:sz w:val="24"/>
+          <w:szCs w:val="24"/>
+        </w:rPr>
+        <w:t xml:space="preserve"> </w:t>
+      </w:r>
+      <w:proofErr w:type="spellStart"/>
+      <w:r>
+        <w:rPr>
+          <w:rFonts w:ascii="Arial Narrow" w:hAnsi="Arial Narrow"/>
+          <w:sz w:val="24"/>
+          <w:szCs w:val="24"/>
+        </w:rPr>
+        <w:t>cara</w:t>
+      </w:r>
+      <w:proofErr w:type="spellEnd"/>
+      <w:r>
+        <w:rPr>
+          <w:rFonts w:ascii="Arial Narrow" w:hAnsi="Arial Narrow"/>
+          <w:sz w:val="24"/>
+          <w:szCs w:val="24"/>
+        </w:rPr>
+        <w:t xml:space="preserve"> </w:t>
+      </w:r>
+      <w:proofErr w:type="spellStart"/>
+      <w:r>
+        <w:rPr>
+          <w:rFonts w:ascii="Arial Narrow" w:hAnsi="Arial Narrow"/>
+          <w:sz w:val="24"/>
+          <w:szCs w:val="24"/>
+        </w:rPr>
+        <w:t>kerja</w:t>
+      </w:r>
+      <w:proofErr w:type="spellEnd"/>
+      <w:r>
+        <w:rPr>
+          <w:rFonts w:ascii="Arial Narrow" w:hAnsi="Arial Narrow"/>
+          <w:sz w:val="24"/>
+          <w:szCs w:val="24"/>
+        </w:rPr>
+        <w:t xml:space="preserve"> dan </w:t>
+      </w:r>
+      <w:proofErr w:type="spellStart"/>
+      <w:r>
+        <w:rPr>
+          <w:rFonts w:ascii="Arial Narrow" w:hAnsi="Arial Narrow"/>
+          <w:sz w:val="24"/>
+          <w:szCs w:val="24"/>
+        </w:rPr>
+        <w:t>penjelasan</w:t>
+      </w:r>
+      <w:proofErr w:type="spellEnd"/>
+      <w:r>
+        <w:rPr>
+          <w:rFonts w:ascii="Arial Narrow" w:hAnsi="Arial Narrow"/>
+          <w:sz w:val="24"/>
+          <w:szCs w:val="24"/>
+        </w:rPr>
+        <w:t xml:space="preserve"> </w:t>
+      </w:r>
+      <w:proofErr w:type="spellStart"/>
+      <w:r>
+        <w:rPr>
+          <w:rFonts w:ascii="Arial Narrow" w:hAnsi="Arial Narrow"/>
+          <w:sz w:val="24"/>
+          <w:szCs w:val="24"/>
+        </w:rPr>
+        <w:t>setiap</w:t>
+      </w:r>
+      <w:proofErr w:type="spellEnd"/>
+      <w:r>
+        <w:rPr>
+          <w:rFonts w:ascii="Arial Narrow" w:hAnsi="Arial Narrow"/>
+          <w:sz w:val="24"/>
+          <w:szCs w:val="24"/>
+        </w:rPr>
+        <w:t xml:space="preserve"> </w:t>
+      </w:r>
+      <w:proofErr w:type="spellStart"/>
+      <w:r>
+        <w:rPr>
+          <w:rFonts w:ascii="Arial Narrow" w:hAnsi="Arial Narrow"/>
+          <w:sz w:val="24"/>
+          <w:szCs w:val="24"/>
+        </w:rPr>
+        <w:t>bagian</w:t>
+      </w:r>
+      <w:proofErr w:type="spellEnd"/>
+      <w:r>
+        <w:rPr>
+          <w:rFonts w:ascii="Arial Narrow" w:hAnsi="Arial Narrow"/>
+          <w:sz w:val="24"/>
+          <w:szCs w:val="24"/>
+        </w:rPr>
+        <w:t xml:space="preserve"> script </w:t>
+      </w:r>
+      <w:proofErr w:type="spellStart"/>
+      <w:r>
+        <w:rPr>
+          <w:rFonts w:ascii="Arial Narrow" w:hAnsi="Arial Narrow"/>
+          <w:sz w:val="24"/>
+          <w:szCs w:val="24"/>
+        </w:rPr>
+        <w:t>tersebut</w:t>
+      </w:r>
+      <w:proofErr w:type="spellEnd"/>
+      <w:r>
+        <w:rPr>
+          <w:rFonts w:ascii="Arial Narrow" w:hAnsi="Arial Narrow"/>
+          <w:sz w:val="24"/>
+          <w:szCs w:val="24"/>
+        </w:rPr>
+        <w:t>:</w:t>
+      </w:r>
+    </w:p>
+    <w:p>
+      <w:pPr>
+        <w:spacing w:after="0" w:line="240" w:lineRule="auto"/>
+        <w:rPr>
+          <w:rFonts w:ascii="Arial Narrow" w:hAnsi="Arial Narrow"/>
+          <w:sz w:val="24"/>
+          <w:szCs w:val="24"/>
+        </w:rPr>
+      </w:pPr>
+      <w:r>
+        <w:rPr>
+          <w:rFonts w:ascii="Arial Narrow" w:hAnsi="Arial Narrow"/>
+          <w:sz w:val="24"/>
+          <w:szCs w:val="24"/>
+        </w:rPr>
+        <w:br/>
+      </w:r>
+    </w:p>
+    <w:p>
+      <w:pPr>
+        <w:numPr>
+          <w:ilvl w:val="0"/>
+          <w:numId w:val="2"/>
+        </w:numPr>
+        <w:spacing w:after="0" w:line="240" w:lineRule="auto"/>
+        <w:rPr>
+          <w:rFonts w:ascii="Arial Narrow" w:hAnsi="Arial Narrow"/>
+          <w:sz w:val="24"/>
+          <w:szCs w:val="24"/>
+        </w:rPr>
+      </w:pPr>
+      <w:proofErr w:type="spellStart"/>
+      <w:r>
+        <w:rPr>
+          <w:rFonts w:ascii="Arial Narrow" w:hAnsi="Arial Narrow"/>
+          <w:b/>
+          <w:bCs/>
+          <w:sz w:val="24"/>
+          <w:szCs w:val="24"/>
+        </w:rPr>
+        <w:t>Pembuatan</w:t>
+      </w:r>
+      <w:proofErr w:type="spellEnd"/>
+      <w:r>
+        <w:rPr>
+          <w:rFonts w:ascii="Arial Narrow" w:hAnsi="Arial Narrow"/>
+          <w:b/>
+          <w:bCs/>
+          <w:sz w:val="24"/>
+          <w:szCs w:val="24"/>
+        </w:rPr>
+        <w:t xml:space="preserve"> </w:t>
+      </w:r>
+      <w:proofErr w:type="spellStart"/>
+      <w:r>
+        <w:rPr>
+          <w:rFonts w:ascii="Arial Narrow" w:hAnsi="Arial Narrow"/>
+          <w:b/>
+          <w:bCs/>
+          <w:sz w:val="24"/>
+          <w:szCs w:val="24"/>
+        </w:rPr>
+        <w:t>Objek</w:t>
+      </w:r>
+      <w:proofErr w:type="spellEnd"/>
+      <w:r>
+        <w:rPr>
+          <w:rFonts w:ascii="Arial Narrow" w:hAnsi="Arial Narrow"/>
+          <w:b/>
+          <w:bCs/>
+          <w:sz w:val="24"/>
+          <w:szCs w:val="24"/>
+        </w:rPr>
+        <w:t xml:space="preserve"> Spreadsheet:</w:t>
+      </w:r>
+      <w:r>
+        <w:rPr>
+          <w:rFonts w:ascii="Arial Narrow" w:hAnsi="Arial Narrow"/>
+          <w:sz w:val="24"/>
+          <w:szCs w:val="24"/>
+        </w:rPr>
+        <w:t xml:space="preserve"> Baris var spreadsheet = </w:t>
+      </w:r>
+      <w:proofErr w:type="spellStart"/>
+      <w:r>
+        <w:rPr>
+          <w:rFonts w:ascii="Arial Narrow" w:hAnsi="Arial Narrow"/>
+          <w:sz w:val="24"/>
+          <w:szCs w:val="24"/>
+        </w:rPr>
+        <w:t>SpreadsheetApp.getActive</w:t>
+      </w:r>
+      <w:proofErr w:type="spellEnd"/>
+      <w:r>
+        <w:rPr>
+          <w:rFonts w:ascii="Arial Narrow" w:hAnsi="Arial Narrow"/>
+          <w:sz w:val="24"/>
+          <w:szCs w:val="24"/>
+        </w:rPr>
+        <w:t xml:space="preserve">(); </w:t>
+      </w:r>
+      <w:proofErr w:type="spellStart"/>
+      <w:r>
+        <w:rPr>
+          <w:rFonts w:ascii="Arial Narrow" w:hAnsi="Arial Narrow"/>
+          <w:sz w:val="24"/>
+          <w:szCs w:val="24"/>
+        </w:rPr>
+        <w:t>berfungsi</w:t>
+      </w:r>
+      <w:proofErr w:type="spellEnd"/>
+      <w:r>
+        <w:rPr>
+          <w:rFonts w:ascii="Arial Narrow" w:hAnsi="Arial Narrow"/>
+          <w:sz w:val="24"/>
+          <w:szCs w:val="24"/>
+        </w:rPr>
+        <w:t xml:space="preserve"> </w:t>
+      </w:r>
+      <w:proofErr w:type="spellStart"/>
+      <w:r>
+        <w:rPr>
+          <w:rFonts w:ascii="Arial Narrow" w:hAnsi="Arial Narrow"/>
+          <w:sz w:val="24"/>
+          <w:szCs w:val="24"/>
+        </w:rPr>
+        <w:t>untuk</w:t>
+      </w:r>
+      <w:proofErr w:type="spellEnd"/>
+      <w:r>
+        <w:rPr>
+          <w:rFonts w:ascii="Arial Narrow" w:hAnsi="Arial Narrow"/>
+          <w:sz w:val="24"/>
+          <w:szCs w:val="24"/>
+        </w:rPr>
+        <w:t xml:space="preserve"> </w:t>
+      </w:r>
+      <w:proofErr w:type="spellStart"/>
+      <w:r>
+        <w:rPr>
+          <w:rFonts w:ascii="Arial Narrow" w:hAnsi="Arial Narrow"/>
+          <w:sz w:val="24"/>
+          <w:szCs w:val="24"/>
+        </w:rPr>
+        <w:t>mengambil</w:t>
+      </w:r>
+      <w:proofErr w:type="spellEnd"/>
+      <w:r>
+        <w:rPr>
+          <w:rFonts w:ascii="Arial Narrow" w:hAnsi="Arial Narrow"/>
+          <w:sz w:val="24"/>
+          <w:szCs w:val="24"/>
+        </w:rPr>
+        <w:t xml:space="preserve"> </w:t>
+      </w:r>
+      <w:proofErr w:type="spellStart"/>
+      <w:r>
+        <w:rPr>
+          <w:rFonts w:ascii="Arial Narrow" w:hAnsi="Arial Narrow"/>
+          <w:sz w:val="24"/>
+          <w:szCs w:val="24"/>
+        </w:rPr>
+        <w:t>atau</w:t>
+      </w:r>
+      <w:proofErr w:type="spellEnd"/>
+      <w:r>
+        <w:rPr>
+          <w:rFonts w:ascii="Arial Narrow" w:hAnsi="Arial Narrow"/>
+          <w:sz w:val="24"/>
+          <w:szCs w:val="24"/>
+        </w:rPr>
+        <w:t xml:space="preserve"> </w:t>
+      </w:r>
+      <w:proofErr w:type="spellStart"/>
+      <w:r>
+        <w:rPr>
+          <w:rFonts w:ascii="Arial Narrow" w:hAnsi="Arial Narrow"/>
+          <w:sz w:val="24"/>
+          <w:szCs w:val="24"/>
+        </w:rPr>
+        <w:t>mengakses</w:t>
+      </w:r>
+      <w:proofErr w:type="spellEnd"/>
+      <w:r>
+        <w:rPr>
+          <w:rFonts w:ascii="Arial Narrow" w:hAnsi="Arial Narrow"/>
+          <w:sz w:val="24"/>
+          <w:szCs w:val="24"/>
+        </w:rPr>
+        <w:t xml:space="preserve"> file Google Spreadsheet yang </w:t>
+      </w:r>
+      <w:proofErr w:type="spellStart"/>
+      <w:r>
+        <w:rPr>
+          <w:rFonts w:ascii="Arial Narrow" w:hAnsi="Arial Narrow"/>
+          <w:sz w:val="24"/>
+          <w:szCs w:val="24"/>
+        </w:rPr>
+        <w:t>sedang</w:t>
+      </w:r>
+      <w:proofErr w:type="spellEnd"/>
+      <w:r>
+        <w:rPr>
+          <w:rFonts w:ascii="Arial Narrow" w:hAnsi="Arial Narrow"/>
+          <w:sz w:val="24"/>
+          <w:szCs w:val="24"/>
+        </w:rPr>
+        <w:t xml:space="preserve"> </w:t>
+      </w:r>
+      <w:proofErr w:type="spellStart"/>
+      <w:r>
+        <w:rPr>
+          <w:rFonts w:ascii="Arial Narrow" w:hAnsi="Arial Narrow"/>
+          <w:sz w:val="24"/>
+          <w:szCs w:val="24"/>
+        </w:rPr>
+        <w:t>dibuka</w:t>
+      </w:r>
+      <w:proofErr w:type="spellEnd"/>
+      <w:r>
+        <w:rPr>
+          <w:rFonts w:ascii="Arial Narrow" w:hAnsi="Arial Narrow"/>
+          <w:sz w:val="24"/>
+          <w:szCs w:val="24"/>
+        </w:rPr>
+        <w:t xml:space="preserve"> oleh </w:t>
+      </w:r>
+      <w:proofErr w:type="spellStart"/>
+      <w:r>
+        <w:rPr>
+          <w:rFonts w:ascii="Arial Narrow" w:hAnsi="Arial Narrow"/>
+          <w:sz w:val="24"/>
+          <w:szCs w:val="24"/>
+        </w:rPr>
+        <w:t>pengguna</w:t>
+      </w:r>
+      <w:proofErr w:type="spellEnd"/>
+      <w:r>
+        <w:rPr>
+          <w:rFonts w:ascii="Arial Narrow" w:hAnsi="Arial Narrow"/>
+          <w:sz w:val="24"/>
+          <w:szCs w:val="24"/>
+        </w:rPr>
+        <w:t>.</w:t>
+      </w:r>
+    </w:p>
+    <w:p>
+      <w:pPr>
+        <w:spacing w:after="0" w:line="240" w:lineRule="auto"/>
+        <w:rPr>
+          <w:rFonts w:ascii="Arial Narrow" w:hAnsi="Arial Narrow"/>
+          <w:sz w:val="24"/>
+          <w:szCs w:val="24"/>
+        </w:rPr>
+      </w:pPr>
+    </w:p>
+    <w:p>
+      <w:pPr>
+        <w:numPr>
+          <w:ilvl w:val="0"/>
+          <w:numId w:val="2"/>
+        </w:numPr>
+        <w:spacing w:after="0" w:line="240" w:lineRule="auto"/>
+        <w:rPr>
+          <w:rFonts w:ascii="Arial Narrow" w:hAnsi="Arial Narrow"/>
+          <w:sz w:val="24"/>
+          <w:szCs w:val="24"/>
+        </w:rPr>
+      </w:pPr>
+      <w:proofErr w:type="spellStart"/>
+      <w:r>
+        <w:rPr>
+          <w:rFonts w:ascii="Arial Narrow" w:hAnsi="Arial Narrow"/>
+          <w:b/>
+          <w:bCs/>
+          <w:sz w:val="24"/>
+          <w:szCs w:val="24"/>
+        </w:rPr>
+        <w:t>Membuat</w:t>
+      </w:r>
+      <w:proofErr w:type="spellEnd"/>
+      <w:r>
+        <w:rPr>
+          <w:rFonts w:ascii="Arial Narrow" w:hAnsi="Arial Narrow"/>
+          <w:b/>
+          <w:bCs/>
+          <w:sz w:val="24"/>
+          <w:szCs w:val="24"/>
+        </w:rPr>
+        <w:t xml:space="preserve"> Header Kolom (Baris 1):</w:t>
+      </w:r>
+      <w:r>
+        <w:rPr>
+          <w:rFonts w:ascii="Arial Narrow" w:hAnsi="Arial Narrow"/>
+          <w:sz w:val="24"/>
+          <w:szCs w:val="24"/>
+        </w:rPr>
+        <w:t xml:space="preserve"> Baris </w:t>
+      </w:r>
+      <w:proofErr w:type="spellStart"/>
+      <w:r>
+        <w:rPr>
+          <w:rFonts w:ascii="Arial Narrow" w:hAnsi="Arial Narrow"/>
+          <w:sz w:val="24"/>
+          <w:szCs w:val="24"/>
+        </w:rPr>
+        <w:t>kode</w:t>
+      </w:r>
+      <w:proofErr w:type="spellEnd"/>
+      <w:r>
+        <w:rPr>
+          <w:rFonts w:ascii="Arial Narrow" w:hAnsi="Arial Narrow"/>
+          <w:sz w:val="24"/>
+          <w:szCs w:val="24"/>
+        </w:rPr>
+        <w:t xml:space="preserve"> yang </w:t>
+      </w:r>
+      <w:proofErr w:type="spellStart"/>
+      <w:r>
+        <w:rPr>
+          <w:rFonts w:ascii="Arial Narrow" w:hAnsi="Arial Narrow"/>
+          <w:sz w:val="24"/>
+          <w:szCs w:val="24"/>
+        </w:rPr>
+        <w:t>menggunakan</w:t>
+      </w:r>
+      <w:proofErr w:type="spellEnd"/>
+      <w:r>
+        <w:rPr>
+          <w:rFonts w:ascii="Arial Narrow" w:hAnsi="Arial Narrow"/>
+          <w:sz w:val="24"/>
+          <w:szCs w:val="24"/>
+        </w:rPr>
+        <w:t xml:space="preserve"> </w:t>
+      </w:r>
+      <w:proofErr w:type="spellStart"/>
+      <w:r>
+        <w:rPr>
+          <w:rFonts w:ascii="Arial Narrow" w:hAnsi="Arial Narrow"/>
+          <w:sz w:val="24"/>
+          <w:szCs w:val="24"/>
+        </w:rPr>
+        <w:t>getRange</w:t>
+      </w:r>
+      <w:proofErr w:type="spellEnd"/>
+      <w:r>
+        <w:rPr>
+          <w:rFonts w:ascii="Arial Narrow" w:hAnsi="Arial Narrow"/>
+          <w:sz w:val="24"/>
+          <w:szCs w:val="24"/>
+        </w:rPr>
+        <w:t>('A1'</w:t>
+      </w:r>
+      <w:proofErr w:type="gramStart"/>
+      <w:r>
+        <w:rPr>
+          <w:rFonts w:ascii="Arial Narrow" w:hAnsi="Arial Narrow"/>
+          <w:sz w:val="24"/>
+          <w:szCs w:val="24"/>
+        </w:rPr>
+        <w:t>).activate</w:t>
+      </w:r>
+      <w:proofErr w:type="gramEnd"/>
+      <w:r>
+        <w:rPr>
+          <w:rFonts w:ascii="Arial Narrow" w:hAnsi="Arial Narrow"/>
+          <w:sz w:val="24"/>
+          <w:szCs w:val="24"/>
+        </w:rPr>
+        <w:t xml:space="preserve">() </w:t>
+      </w:r>
+      <w:proofErr w:type="spellStart"/>
+      <w:r>
+        <w:rPr>
+          <w:rFonts w:ascii="Arial Narrow" w:hAnsi="Arial Narrow"/>
+          <w:sz w:val="24"/>
+          <w:szCs w:val="24"/>
+        </w:rPr>
+        <w:t>hingga</w:t>
+      </w:r>
+      <w:proofErr w:type="spellEnd"/>
+      <w:r>
+        <w:rPr>
+          <w:rFonts w:ascii="Arial Narrow" w:hAnsi="Arial Narrow"/>
+          <w:sz w:val="24"/>
+          <w:szCs w:val="24"/>
+        </w:rPr>
+        <w:t xml:space="preserve"> </w:t>
+      </w:r>
+      <w:proofErr w:type="spellStart"/>
+      <w:r>
+        <w:rPr>
+          <w:rFonts w:ascii="Arial Narrow" w:hAnsi="Arial Narrow"/>
+          <w:sz w:val="24"/>
+          <w:szCs w:val="24"/>
+        </w:rPr>
+        <w:t>getRange</w:t>
+      </w:r>
+      <w:proofErr w:type="spellEnd"/>
+      <w:r>
+        <w:rPr>
+          <w:rFonts w:ascii="Arial Narrow" w:hAnsi="Arial Narrow"/>
+          <w:sz w:val="24"/>
+          <w:szCs w:val="24"/>
+        </w:rPr>
+        <w:t>('D1'</w:t>
+      </w:r>
+      <w:proofErr w:type="gramStart"/>
+      <w:r>
+        <w:rPr>
+          <w:rFonts w:ascii="Arial Narrow" w:hAnsi="Arial Narrow"/>
+          <w:sz w:val="24"/>
+          <w:szCs w:val="24"/>
+        </w:rPr>
+        <w:t>).activate</w:t>
+      </w:r>
+      <w:proofErr w:type="gramEnd"/>
+      <w:r>
+        <w:rPr>
+          <w:rFonts w:ascii="Arial Narrow" w:hAnsi="Arial Narrow"/>
+          <w:sz w:val="24"/>
+          <w:szCs w:val="24"/>
+        </w:rPr>
+        <w:t xml:space="preserve">() </w:t>
+      </w:r>
+      <w:proofErr w:type="spellStart"/>
+      <w:r>
+        <w:rPr>
+          <w:rFonts w:ascii="Arial Narrow" w:hAnsi="Arial Narrow"/>
+          <w:sz w:val="24"/>
+          <w:szCs w:val="24"/>
+        </w:rPr>
+        <w:t>berturut-turut</w:t>
+      </w:r>
+      <w:proofErr w:type="spellEnd"/>
+      <w:r>
+        <w:rPr>
+          <w:rFonts w:ascii="Arial Narrow" w:hAnsi="Arial Narrow"/>
+          <w:sz w:val="24"/>
+          <w:szCs w:val="24"/>
+        </w:rPr>
+        <w:t xml:space="preserve"> </w:t>
+      </w:r>
+      <w:proofErr w:type="spellStart"/>
+      <w:r>
+        <w:rPr>
+          <w:rFonts w:ascii="Arial Narrow" w:hAnsi="Arial Narrow"/>
+          <w:sz w:val="24"/>
+          <w:szCs w:val="24"/>
+        </w:rPr>
+        <w:t>memilih</w:t>
+      </w:r>
+      <w:proofErr w:type="spellEnd"/>
+      <w:r>
+        <w:rPr>
+          <w:rFonts w:ascii="Arial Narrow" w:hAnsi="Arial Narrow"/>
+          <w:sz w:val="24"/>
+          <w:szCs w:val="24"/>
+        </w:rPr>
+        <w:t xml:space="preserve"> </w:t>
+      </w:r>
+      <w:proofErr w:type="spellStart"/>
+      <w:r>
+        <w:rPr>
+          <w:rFonts w:ascii="Arial Narrow" w:hAnsi="Arial Narrow"/>
+          <w:sz w:val="24"/>
+          <w:szCs w:val="24"/>
+        </w:rPr>
+        <w:t>sel</w:t>
+      </w:r>
+      <w:proofErr w:type="spellEnd"/>
+      <w:r>
+        <w:rPr>
+          <w:rFonts w:ascii="Arial Narrow" w:hAnsi="Arial Narrow"/>
+          <w:sz w:val="24"/>
+          <w:szCs w:val="24"/>
+        </w:rPr>
+        <w:t xml:space="preserve"> A1, B1, C1, dan D1, </w:t>
+      </w:r>
+      <w:proofErr w:type="spellStart"/>
+      <w:r>
+        <w:rPr>
+          <w:rFonts w:ascii="Arial Narrow" w:hAnsi="Arial Narrow"/>
+          <w:sz w:val="24"/>
+          <w:szCs w:val="24"/>
+        </w:rPr>
+        <w:t>kemudian</w:t>
+      </w:r>
+      <w:proofErr w:type="spellEnd"/>
+      <w:r>
+        <w:rPr>
+          <w:rFonts w:ascii="Arial Narrow" w:hAnsi="Arial Narrow"/>
+          <w:sz w:val="24"/>
+          <w:szCs w:val="24"/>
+        </w:rPr>
+        <w:t xml:space="preserve"> method </w:t>
+      </w:r>
+      <w:proofErr w:type="spellStart"/>
+      <w:r>
+        <w:rPr>
+          <w:rFonts w:ascii="Arial Narrow" w:hAnsi="Arial Narrow"/>
+          <w:sz w:val="24"/>
+          <w:szCs w:val="24"/>
+        </w:rPr>
+        <w:t>setValue</w:t>
+      </w:r>
+      <w:proofErr w:type="spellEnd"/>
+      <w:r>
+        <w:rPr>
+          <w:rFonts w:ascii="Arial Narrow" w:hAnsi="Arial Narrow"/>
+          <w:sz w:val="24"/>
+          <w:szCs w:val="24"/>
+        </w:rPr>
+        <w:t xml:space="preserve">(...) </w:t>
+      </w:r>
+      <w:proofErr w:type="spellStart"/>
+      <w:r>
+        <w:rPr>
+          <w:rFonts w:ascii="Arial Narrow" w:hAnsi="Arial Narrow"/>
+          <w:sz w:val="24"/>
+          <w:szCs w:val="24"/>
+        </w:rPr>
+        <w:t>mengisinya</w:t>
+      </w:r>
+      <w:proofErr w:type="spellEnd"/>
+      <w:r>
+        <w:rPr>
+          <w:rFonts w:ascii="Arial Narrow" w:hAnsi="Arial Narrow"/>
+          <w:sz w:val="24"/>
+          <w:szCs w:val="24"/>
+        </w:rPr>
+        <w:t xml:space="preserve"> </w:t>
+      </w:r>
+      <w:proofErr w:type="spellStart"/>
+      <w:r>
+        <w:rPr>
+          <w:rFonts w:ascii="Arial Narrow" w:hAnsi="Arial Narrow"/>
+          <w:sz w:val="24"/>
+          <w:szCs w:val="24"/>
+        </w:rPr>
+        <w:t>dengan</w:t>
+      </w:r>
+      <w:proofErr w:type="spellEnd"/>
+      <w:r>
+        <w:rPr>
+          <w:rFonts w:ascii="Arial Narrow" w:hAnsi="Arial Narrow"/>
+          <w:sz w:val="24"/>
+          <w:szCs w:val="24"/>
+        </w:rPr>
+        <w:t xml:space="preserve"> </w:t>
+      </w:r>
+      <w:proofErr w:type="spellStart"/>
+      <w:r>
+        <w:rPr>
+          <w:rFonts w:ascii="Arial Narrow" w:hAnsi="Arial Narrow"/>
+          <w:sz w:val="24"/>
+          <w:szCs w:val="24"/>
+        </w:rPr>
+        <w:t>teks</w:t>
+      </w:r>
+      <w:proofErr w:type="spellEnd"/>
+      <w:r>
+        <w:rPr>
+          <w:rFonts w:ascii="Arial Narrow" w:hAnsi="Arial Narrow"/>
+          <w:sz w:val="24"/>
+          <w:szCs w:val="24"/>
+        </w:rPr>
+        <w:t xml:space="preserve"> </w:t>
+      </w:r>
+      <w:proofErr w:type="spellStart"/>
+      <w:r>
+        <w:rPr>
+          <w:rFonts w:ascii="Arial Narrow" w:hAnsi="Arial Narrow"/>
+          <w:sz w:val="24"/>
+          <w:szCs w:val="24"/>
+        </w:rPr>
+        <w:t>judul</w:t>
+      </w:r>
+      <w:proofErr w:type="spellEnd"/>
+      <w:r>
+        <w:rPr>
+          <w:rFonts w:ascii="Arial Narrow" w:hAnsi="Arial Narrow"/>
+          <w:sz w:val="24"/>
+          <w:szCs w:val="24"/>
+        </w:rPr>
+        <w:t xml:space="preserve"> </w:t>
+      </w:r>
+      <w:proofErr w:type="spellStart"/>
+      <w:r>
+        <w:rPr>
+          <w:rFonts w:ascii="Arial Narrow" w:hAnsi="Arial Narrow"/>
+          <w:sz w:val="24"/>
+          <w:szCs w:val="24"/>
+        </w:rPr>
+        <w:t>kolom</w:t>
+      </w:r>
+      <w:proofErr w:type="spellEnd"/>
+      <w:r>
+        <w:rPr>
+          <w:rFonts w:ascii="Arial Narrow" w:hAnsi="Arial Narrow"/>
+          <w:sz w:val="24"/>
+          <w:szCs w:val="24"/>
+        </w:rPr>
+        <w:t xml:space="preserve">, </w:t>
+      </w:r>
+      <w:proofErr w:type="spellStart"/>
+      <w:r>
+        <w:rPr>
+          <w:rFonts w:ascii="Arial Narrow" w:hAnsi="Arial Narrow"/>
+          <w:sz w:val="24"/>
+          <w:szCs w:val="24"/>
+        </w:rPr>
+        <w:t>yaitu</w:t>
+      </w:r>
+      <w:proofErr w:type="spellEnd"/>
+      <w:r>
+        <w:rPr>
+          <w:rFonts w:ascii="Arial Narrow" w:hAnsi="Arial Narrow"/>
+          <w:sz w:val="24"/>
+          <w:szCs w:val="24"/>
+        </w:rPr>
+        <w:t xml:space="preserve"> 'no', 'nama', '</w:t>
+      </w:r>
+      <w:proofErr w:type="spellStart"/>
+      <w:r>
+        <w:rPr>
+          <w:rFonts w:ascii="Arial Narrow" w:hAnsi="Arial Narrow"/>
+          <w:sz w:val="24"/>
+          <w:szCs w:val="24"/>
+        </w:rPr>
+        <w:t>tanggal</w:t>
+      </w:r>
+      <w:proofErr w:type="spellEnd"/>
+      <w:r>
+        <w:rPr>
+          <w:rFonts w:ascii="Arial Narrow" w:hAnsi="Arial Narrow"/>
+          <w:sz w:val="24"/>
+          <w:szCs w:val="24"/>
+        </w:rPr>
+        <w:t>', dan '</w:t>
+      </w:r>
+      <w:proofErr w:type="spellStart"/>
+      <w:r>
+        <w:rPr>
+          <w:rFonts w:ascii="Arial Narrow" w:hAnsi="Arial Narrow"/>
+          <w:sz w:val="24"/>
+          <w:szCs w:val="24"/>
+        </w:rPr>
+        <w:t>keterangan</w:t>
+      </w:r>
+      <w:proofErr w:type="spellEnd"/>
+      <w:r>
+        <w:rPr>
+          <w:rFonts w:ascii="Arial Narrow" w:hAnsi="Arial Narrow"/>
+          <w:sz w:val="24"/>
+          <w:szCs w:val="24"/>
+        </w:rPr>
+        <w:t>'.</w:t>
+      </w:r>
+    </w:p>
+    <w:p>
+      <w:pPr>
+        <w:spacing w:after="0" w:line="240" w:lineRule="auto"/>
+        <w:rPr>
+          <w:rFonts w:ascii="Arial Narrow" w:hAnsi="Arial Narrow"/>
+          <w:sz w:val="24"/>
+          <w:szCs w:val="24"/>
+        </w:rPr>
+      </w:pPr>
+    </w:p>
+    <w:p>
+      <w:pPr>
+        <w:numPr>
+          <w:ilvl w:val="0"/>
+          <w:numId w:val="2"/>
+        </w:numPr>
+        <w:spacing w:after="0" w:line="240" w:lineRule="auto"/>
+        <w:rPr>
+          <w:rFonts w:ascii="Arial Narrow" w:hAnsi="Arial Narrow"/>
+          <w:sz w:val="24"/>
+          <w:szCs w:val="24"/>
+        </w:rPr>
+      </w:pPr>
+      <w:proofErr w:type="spellStart"/>
+      <w:r>
+        <w:rPr>
+          <w:rFonts w:ascii="Arial Narrow" w:hAnsi="Arial Narrow"/>
+          <w:b/>
+          <w:bCs/>
+          <w:sz w:val="24"/>
+          <w:szCs w:val="24"/>
+        </w:rPr>
+        <w:t>Mengisi</w:t>
+      </w:r>
+      <w:proofErr w:type="spellEnd"/>
+      <w:r>
+        <w:rPr>
+          <w:rFonts w:ascii="Arial Narrow" w:hAnsi="Arial Narrow"/>
+          <w:b/>
+          <w:bCs/>
+          <w:sz w:val="24"/>
+          <w:szCs w:val="24"/>
+        </w:rPr>
+        <w:t xml:space="preserve"> </w:t>
+      </w:r>
+      <w:proofErr w:type="spellStart"/>
+      <w:r>
+        <w:rPr>
+          <w:rFonts w:ascii="Arial Narrow" w:hAnsi="Arial Narrow"/>
+          <w:b/>
+          <w:bCs/>
+          <w:sz w:val="24"/>
+          <w:szCs w:val="24"/>
+        </w:rPr>
+        <w:t>Nomor</w:t>
+      </w:r>
+      <w:proofErr w:type="spellEnd"/>
+      <w:r>
+        <w:rPr>
+          <w:rFonts w:ascii="Arial Narrow" w:hAnsi="Arial Narrow"/>
+          <w:b/>
+          <w:bCs/>
+          <w:sz w:val="24"/>
+          <w:szCs w:val="24"/>
+        </w:rPr>
+        <w:t xml:space="preserve"> </w:t>
+      </w:r>
+      <w:proofErr w:type="spellStart"/>
+      <w:r>
+        <w:rPr>
+          <w:rFonts w:ascii="Arial Narrow" w:hAnsi="Arial Narrow"/>
+          <w:b/>
+          <w:bCs/>
+          <w:sz w:val="24"/>
+          <w:szCs w:val="24"/>
+        </w:rPr>
+        <w:t>Urut</w:t>
+      </w:r>
+      <w:proofErr w:type="spellEnd"/>
+      <w:r>
+        <w:rPr>
+          <w:rFonts w:ascii="Arial Narrow" w:hAnsi="Arial Narrow"/>
+          <w:b/>
+          <w:bCs/>
+          <w:sz w:val="24"/>
+          <w:szCs w:val="24"/>
+        </w:rPr>
+        <w:t xml:space="preserve"> (Kolom A):</w:t>
+      </w:r>
+      <w:r>
+        <w:rPr>
+          <w:rFonts w:ascii="Arial Narrow" w:hAnsi="Arial Narrow"/>
+          <w:sz w:val="24"/>
+          <w:szCs w:val="24"/>
+        </w:rPr>
+        <w:t xml:space="preserve"> Baris </w:t>
+      </w:r>
+      <w:proofErr w:type="spellStart"/>
+      <w:r>
+        <w:rPr>
+          <w:rFonts w:ascii="Arial Narrow" w:hAnsi="Arial Narrow"/>
+          <w:sz w:val="24"/>
+          <w:szCs w:val="24"/>
+        </w:rPr>
+        <w:t>kode</w:t>
+      </w:r>
+      <w:proofErr w:type="spellEnd"/>
+      <w:r>
+        <w:rPr>
+          <w:rFonts w:ascii="Arial Narrow" w:hAnsi="Arial Narrow"/>
+          <w:sz w:val="24"/>
+          <w:szCs w:val="24"/>
+        </w:rPr>
+        <w:t xml:space="preserve"> </w:t>
+      </w:r>
+      <w:proofErr w:type="spellStart"/>
+      <w:r>
+        <w:rPr>
+          <w:rFonts w:ascii="Arial Narrow" w:hAnsi="Arial Narrow"/>
+          <w:sz w:val="24"/>
+          <w:szCs w:val="24"/>
+        </w:rPr>
+        <w:t>getRange</w:t>
+      </w:r>
+      <w:proofErr w:type="spellEnd"/>
+      <w:r>
+        <w:rPr>
+          <w:rFonts w:ascii="Arial Narrow" w:hAnsi="Arial Narrow"/>
+          <w:sz w:val="24"/>
+          <w:szCs w:val="24"/>
+        </w:rPr>
+        <w:t xml:space="preserve">('A2'), A3, dan A4 </w:t>
+      </w:r>
+      <w:proofErr w:type="spellStart"/>
+      <w:r>
+        <w:rPr>
+          <w:rFonts w:ascii="Arial Narrow" w:hAnsi="Arial Narrow"/>
+          <w:sz w:val="24"/>
+          <w:szCs w:val="24"/>
+        </w:rPr>
+        <w:t>diaktifkan</w:t>
+      </w:r>
+      <w:proofErr w:type="spellEnd"/>
+      <w:r>
+        <w:rPr>
+          <w:rFonts w:ascii="Arial Narrow" w:hAnsi="Arial Narrow"/>
+          <w:sz w:val="24"/>
+          <w:szCs w:val="24"/>
+        </w:rPr>
+        <w:t xml:space="preserve"> </w:t>
+      </w:r>
+      <w:proofErr w:type="spellStart"/>
+      <w:r>
+        <w:rPr>
+          <w:rFonts w:ascii="Arial Narrow" w:hAnsi="Arial Narrow"/>
+          <w:sz w:val="24"/>
+          <w:szCs w:val="24"/>
+        </w:rPr>
+        <w:t>secara</w:t>
+      </w:r>
+      <w:proofErr w:type="spellEnd"/>
+      <w:r>
+        <w:rPr>
+          <w:rFonts w:ascii="Arial Narrow" w:hAnsi="Arial Narrow"/>
+          <w:sz w:val="24"/>
+          <w:szCs w:val="24"/>
+        </w:rPr>
+        <w:t xml:space="preserve"> </w:t>
+      </w:r>
+      <w:proofErr w:type="spellStart"/>
+      <w:r>
+        <w:rPr>
+          <w:rFonts w:ascii="Arial Narrow" w:hAnsi="Arial Narrow"/>
+          <w:sz w:val="24"/>
+          <w:szCs w:val="24"/>
+        </w:rPr>
+        <w:t>bergantian</w:t>
+      </w:r>
+      <w:proofErr w:type="spellEnd"/>
+      <w:r>
+        <w:rPr>
+          <w:rFonts w:ascii="Arial Narrow" w:hAnsi="Arial Narrow"/>
+          <w:sz w:val="24"/>
+          <w:szCs w:val="24"/>
+        </w:rPr>
+        <w:t xml:space="preserve"> </w:t>
+      </w:r>
+      <w:proofErr w:type="spellStart"/>
+      <w:r>
+        <w:rPr>
+          <w:rFonts w:ascii="Arial Narrow" w:hAnsi="Arial Narrow"/>
+          <w:sz w:val="24"/>
+          <w:szCs w:val="24"/>
+        </w:rPr>
+        <w:t>untuk</w:t>
+      </w:r>
+      <w:proofErr w:type="spellEnd"/>
+      <w:r>
+        <w:rPr>
+          <w:rFonts w:ascii="Arial Narrow" w:hAnsi="Arial Narrow"/>
+          <w:sz w:val="24"/>
+          <w:szCs w:val="24"/>
+        </w:rPr>
+        <w:t xml:space="preserve"> </w:t>
+      </w:r>
+      <w:proofErr w:type="spellStart"/>
+      <w:r>
+        <w:rPr>
+          <w:rFonts w:ascii="Arial Narrow" w:hAnsi="Arial Narrow"/>
+          <w:sz w:val="24"/>
+          <w:szCs w:val="24"/>
+        </w:rPr>
+        <w:t>memasukkan</w:t>
+      </w:r>
+      <w:proofErr w:type="spellEnd"/>
+      <w:r>
+        <w:rPr>
+          <w:rFonts w:ascii="Arial Narrow" w:hAnsi="Arial Narrow"/>
+          <w:sz w:val="24"/>
+          <w:szCs w:val="24"/>
+        </w:rPr>
+        <w:t xml:space="preserve"> </w:t>
+      </w:r>
+      <w:proofErr w:type="spellStart"/>
+      <w:r>
+        <w:rPr>
+          <w:rFonts w:ascii="Arial Narrow" w:hAnsi="Arial Narrow"/>
+          <w:sz w:val="24"/>
+          <w:szCs w:val="24"/>
+        </w:rPr>
+        <w:t>angka</w:t>
+      </w:r>
+      <w:proofErr w:type="spellEnd"/>
+      <w:r>
+        <w:rPr>
+          <w:rFonts w:ascii="Arial Narrow" w:hAnsi="Arial Narrow"/>
+          <w:sz w:val="24"/>
+          <w:szCs w:val="24"/>
+        </w:rPr>
+        <w:t xml:space="preserve"> </w:t>
+      </w:r>
+      <w:proofErr w:type="spellStart"/>
+      <w:r>
+        <w:rPr>
+          <w:rFonts w:ascii="Arial Narrow" w:hAnsi="Arial Narrow"/>
+          <w:sz w:val="24"/>
+          <w:szCs w:val="24"/>
+        </w:rPr>
+        <w:t>urut</w:t>
+      </w:r>
+      <w:proofErr w:type="spellEnd"/>
+      <w:r>
+        <w:rPr>
+          <w:rFonts w:ascii="Arial Narrow" w:hAnsi="Arial Narrow"/>
+          <w:sz w:val="24"/>
+          <w:szCs w:val="24"/>
+        </w:rPr>
+        <w:t xml:space="preserve"> 1, 2, dan 3 pada </w:t>
+      </w:r>
+      <w:proofErr w:type="spellStart"/>
+      <w:r>
+        <w:rPr>
+          <w:rFonts w:ascii="Arial Narrow" w:hAnsi="Arial Narrow"/>
+          <w:sz w:val="24"/>
+          <w:szCs w:val="24"/>
+        </w:rPr>
+        <w:t>kolom</w:t>
+      </w:r>
+      <w:proofErr w:type="spellEnd"/>
+      <w:r>
+        <w:rPr>
+          <w:rFonts w:ascii="Arial Narrow" w:hAnsi="Arial Narrow"/>
+          <w:sz w:val="24"/>
+          <w:szCs w:val="24"/>
+        </w:rPr>
+        <w:t xml:space="preserve"> A.</w:t>
+      </w:r>
+    </w:p>
+    <w:p>
+      <w:pPr>
+        <w:spacing w:after="0" w:line="240" w:lineRule="auto"/>
+        <w:rPr>
+          <w:rFonts w:ascii="Arial Narrow" w:hAnsi="Arial Narrow"/>
+          <w:sz w:val="24"/>
+          <w:szCs w:val="24"/>
+        </w:rPr>
+      </w:pPr>
+    </w:p>
+    <w:p>
+      <w:pPr>
+        <w:numPr>
+          <w:ilvl w:val="0"/>
+          <w:numId w:val="2"/>
+        </w:numPr>
+        <w:spacing w:after="0" w:line="240" w:lineRule="auto"/>
+        <w:rPr>
+          <w:rFonts w:ascii="Arial Narrow" w:hAnsi="Arial Narrow"/>
+          <w:sz w:val="24"/>
+          <w:szCs w:val="24"/>
+        </w:rPr>
+      </w:pPr>
+      <w:proofErr w:type="spellStart"/>
+      <w:r>
+        <w:rPr>
+          <w:rFonts w:ascii="Arial Narrow" w:hAnsi="Arial Narrow"/>
+          <w:b/>
+          <w:bCs/>
+          <w:sz w:val="24"/>
+          <w:szCs w:val="24"/>
+        </w:rPr>
+        <w:t>Mengisi</w:t>
+      </w:r>
+      <w:proofErr w:type="spellEnd"/>
+      <w:r>
+        <w:rPr>
+          <w:rFonts w:ascii="Arial Narrow" w:hAnsi="Arial Narrow"/>
+          <w:b/>
+          <w:bCs/>
+          <w:sz w:val="24"/>
+          <w:szCs w:val="24"/>
+        </w:rPr>
+        <w:t xml:space="preserve"> Data Nama (Kolom B):</w:t>
+      </w:r>
+      <w:r>
+        <w:rPr>
+          <w:rFonts w:ascii="Arial Narrow" w:hAnsi="Arial Narrow"/>
+          <w:sz w:val="24"/>
+          <w:szCs w:val="24"/>
+        </w:rPr>
+        <w:t xml:space="preserve"> Baris </w:t>
+      </w:r>
+      <w:proofErr w:type="spellStart"/>
+      <w:r>
+        <w:rPr>
+          <w:rFonts w:ascii="Arial Narrow" w:hAnsi="Arial Narrow"/>
+          <w:sz w:val="24"/>
+          <w:szCs w:val="24"/>
+        </w:rPr>
+        <w:t>kode</w:t>
+      </w:r>
+      <w:proofErr w:type="spellEnd"/>
+      <w:r>
+        <w:rPr>
+          <w:rFonts w:ascii="Arial Narrow" w:hAnsi="Arial Narrow"/>
+          <w:sz w:val="24"/>
+          <w:szCs w:val="24"/>
+        </w:rPr>
+        <w:t xml:space="preserve"> </w:t>
+      </w:r>
+      <w:proofErr w:type="spellStart"/>
+      <w:r>
+        <w:rPr>
+          <w:rFonts w:ascii="Arial Narrow" w:hAnsi="Arial Narrow"/>
+          <w:sz w:val="24"/>
+          <w:szCs w:val="24"/>
+        </w:rPr>
+        <w:t>untuk</w:t>
+      </w:r>
+      <w:proofErr w:type="spellEnd"/>
+      <w:r>
+        <w:rPr>
+          <w:rFonts w:ascii="Arial Narrow" w:hAnsi="Arial Narrow"/>
+          <w:sz w:val="24"/>
+          <w:szCs w:val="24"/>
+        </w:rPr>
+        <w:t xml:space="preserve"> </w:t>
+      </w:r>
+      <w:proofErr w:type="spellStart"/>
+      <w:r>
+        <w:rPr>
+          <w:rFonts w:ascii="Arial Narrow" w:hAnsi="Arial Narrow"/>
+          <w:sz w:val="24"/>
+          <w:szCs w:val="24"/>
+        </w:rPr>
+        <w:t>sel</w:t>
+      </w:r>
+      <w:proofErr w:type="spellEnd"/>
+      <w:r>
+        <w:rPr>
+          <w:rFonts w:ascii="Arial Narrow" w:hAnsi="Arial Narrow"/>
+          <w:sz w:val="24"/>
+          <w:szCs w:val="24"/>
+        </w:rPr>
+        <w:t xml:space="preserve"> B2, B3, dan B4 </w:t>
+      </w:r>
+      <w:proofErr w:type="spellStart"/>
+      <w:r>
+        <w:rPr>
+          <w:rFonts w:ascii="Arial Narrow" w:hAnsi="Arial Narrow"/>
+          <w:sz w:val="24"/>
+          <w:szCs w:val="24"/>
+        </w:rPr>
+        <w:t>digunakan</w:t>
+      </w:r>
+      <w:proofErr w:type="spellEnd"/>
+      <w:r>
+        <w:rPr>
+          <w:rFonts w:ascii="Arial Narrow" w:hAnsi="Arial Narrow"/>
+          <w:sz w:val="24"/>
+          <w:szCs w:val="24"/>
+        </w:rPr>
+        <w:t xml:space="preserve"> </w:t>
+      </w:r>
+      <w:proofErr w:type="spellStart"/>
+      <w:r>
+        <w:rPr>
+          <w:rFonts w:ascii="Arial Narrow" w:hAnsi="Arial Narrow"/>
+          <w:sz w:val="24"/>
+          <w:szCs w:val="24"/>
+        </w:rPr>
+        <w:t>untuk</w:t>
+      </w:r>
+      <w:proofErr w:type="spellEnd"/>
+      <w:r>
+        <w:rPr>
+          <w:rFonts w:ascii="Arial Narrow" w:hAnsi="Arial Narrow"/>
+          <w:sz w:val="24"/>
+          <w:szCs w:val="24"/>
+        </w:rPr>
+        <w:t xml:space="preserve"> </w:t>
+      </w:r>
+      <w:proofErr w:type="spellStart"/>
+      <w:r>
+        <w:rPr>
+          <w:rFonts w:ascii="Arial Narrow" w:hAnsi="Arial Narrow"/>
+          <w:sz w:val="24"/>
+          <w:szCs w:val="24"/>
+        </w:rPr>
+        <w:t>memasukkan</w:t>
+      </w:r>
+      <w:proofErr w:type="spellEnd"/>
+      <w:r>
+        <w:rPr>
+          <w:rFonts w:ascii="Arial Narrow" w:hAnsi="Arial Narrow"/>
+          <w:sz w:val="24"/>
+          <w:szCs w:val="24"/>
+        </w:rPr>
+        <w:t xml:space="preserve"> data nama </w:t>
+      </w:r>
+      <w:proofErr w:type="spellStart"/>
+      <w:r>
+        <w:rPr>
+          <w:rFonts w:ascii="Arial Narrow" w:hAnsi="Arial Narrow"/>
+          <w:sz w:val="24"/>
+          <w:szCs w:val="24"/>
+        </w:rPr>
+        <w:t>ke</w:t>
+      </w:r>
+      <w:proofErr w:type="spellEnd"/>
+      <w:r>
+        <w:rPr>
+          <w:rFonts w:ascii="Arial Narrow" w:hAnsi="Arial Narrow"/>
+          <w:sz w:val="24"/>
+          <w:szCs w:val="24"/>
+        </w:rPr>
+        <w:t xml:space="preserve"> </w:t>
+      </w:r>
+      <w:proofErr w:type="spellStart"/>
+      <w:r>
+        <w:rPr>
+          <w:rFonts w:ascii="Arial Narrow" w:hAnsi="Arial Narrow"/>
+          <w:sz w:val="24"/>
+          <w:szCs w:val="24"/>
+        </w:rPr>
+        <w:t>dalam</w:t>
+      </w:r>
+      <w:proofErr w:type="spellEnd"/>
+      <w:r>
+        <w:rPr>
+          <w:rFonts w:ascii="Arial Narrow" w:hAnsi="Arial Narrow"/>
+          <w:sz w:val="24"/>
+          <w:szCs w:val="24"/>
+        </w:rPr>
+        <w:t xml:space="preserve"> </w:t>
+      </w:r>
+      <w:proofErr w:type="spellStart"/>
+      <w:r>
+        <w:rPr>
+          <w:rFonts w:ascii="Arial Narrow" w:hAnsi="Arial Narrow"/>
+          <w:sz w:val="24"/>
+          <w:szCs w:val="24"/>
+        </w:rPr>
+        <w:t>tabel</w:t>
+      </w:r>
+      <w:proofErr w:type="spellEnd"/>
+      <w:r>
+        <w:rPr>
+          <w:rFonts w:ascii="Arial Narrow" w:hAnsi="Arial Narrow"/>
+          <w:sz w:val="24"/>
+          <w:szCs w:val="24"/>
+        </w:rPr>
+        <w:t xml:space="preserve">, masing-masing </w:t>
+      </w:r>
+      <w:proofErr w:type="spellStart"/>
+      <w:r>
+        <w:rPr>
+          <w:rFonts w:ascii="Arial Narrow" w:hAnsi="Arial Narrow"/>
+          <w:sz w:val="24"/>
+          <w:szCs w:val="24"/>
+        </w:rPr>
+        <w:t>dengan</w:t>
+      </w:r>
+      <w:proofErr w:type="spellEnd"/>
+      <w:r>
+        <w:rPr>
+          <w:rFonts w:ascii="Arial Narrow" w:hAnsi="Arial Narrow"/>
+          <w:sz w:val="24"/>
+          <w:szCs w:val="24"/>
+        </w:rPr>
+        <w:t xml:space="preserve"> </w:t>
+      </w:r>
+      <w:proofErr w:type="spellStart"/>
+      <w:r>
+        <w:rPr>
+          <w:rFonts w:ascii="Arial Narrow" w:hAnsi="Arial Narrow"/>
+          <w:sz w:val="24"/>
+          <w:szCs w:val="24"/>
+        </w:rPr>
+        <w:t>nilai</w:t>
+      </w:r>
+      <w:proofErr w:type="spellEnd"/>
+      <w:r>
+        <w:rPr>
+          <w:rFonts w:ascii="Arial Narrow" w:hAnsi="Arial Narrow"/>
+          <w:sz w:val="24"/>
+          <w:szCs w:val="24"/>
+        </w:rPr>
+        <w:t xml:space="preserve"> 'sapik', '</w:t>
+      </w:r>
+      <w:proofErr w:type="spellStart"/>
+      <w:r>
+        <w:rPr>
+          <w:rFonts w:ascii="Arial Narrow" w:hAnsi="Arial Narrow"/>
+          <w:sz w:val="24"/>
+          <w:szCs w:val="24"/>
+        </w:rPr>
+        <w:t>adi</w:t>
+      </w:r>
+      <w:proofErr w:type="spellEnd"/>
+      <w:r>
+        <w:rPr>
+          <w:rFonts w:ascii="Arial Narrow" w:hAnsi="Arial Narrow"/>
+          <w:sz w:val="24"/>
+          <w:szCs w:val="24"/>
+        </w:rPr>
+        <w:t>', dan '</w:t>
+      </w:r>
+      <w:proofErr w:type="spellStart"/>
+      <w:r>
+        <w:rPr>
+          <w:rFonts w:ascii="Arial Narrow" w:hAnsi="Arial Narrow"/>
+          <w:sz w:val="24"/>
+          <w:szCs w:val="24"/>
+        </w:rPr>
+        <w:t>rudi</w:t>
+      </w:r>
+      <w:proofErr w:type="spellEnd"/>
+      <w:r>
+        <w:rPr>
+          <w:rFonts w:ascii="Arial Narrow" w:hAnsi="Arial Narrow"/>
+          <w:sz w:val="24"/>
+          <w:szCs w:val="24"/>
+        </w:rPr>
+        <w:t>'.</w:t>
+      </w:r>
+    </w:p>
+    <w:p>
+      <w:pPr>
+        <w:spacing w:after="0" w:line="240" w:lineRule="auto"/>
+        <w:rPr>
+          <w:rFonts w:ascii="Arial Narrow" w:hAnsi="Arial Narrow"/>
+          <w:sz w:val="24"/>
+          <w:szCs w:val="24"/>
+        </w:rPr>
+      </w:pPr>
+    </w:p>
+    <w:p>
+      <w:pPr>
+        <w:numPr>
+          <w:ilvl w:val="0"/>
+          <w:numId w:val="2"/>
+        </w:numPr>
+        <w:spacing w:after="0" w:line="240" w:lineRule="auto"/>
+        <w:rPr>
+          <w:rFonts w:ascii="Arial Narrow" w:hAnsi="Arial Narrow"/>
+          <w:sz w:val="24"/>
+          <w:szCs w:val="24"/>
+        </w:rPr>
+      </w:pPr>
+      <w:proofErr w:type="spellStart"/>
+      <w:r>
+        <w:rPr>
+          <w:rFonts w:ascii="Arial Narrow" w:hAnsi="Arial Narrow"/>
+          <w:b/>
+          <w:bCs/>
+          <w:sz w:val="24"/>
+          <w:szCs w:val="24"/>
+        </w:rPr>
+        <w:t>Mengisi</w:t>
+      </w:r>
+      <w:proofErr w:type="spellEnd"/>
+      <w:r>
+        <w:rPr>
+          <w:rFonts w:ascii="Arial Narrow" w:hAnsi="Arial Narrow"/>
+          <w:b/>
+          <w:bCs/>
+          <w:sz w:val="24"/>
+          <w:szCs w:val="24"/>
+        </w:rPr>
+        <w:t xml:space="preserve"> Data </w:t>
+      </w:r>
+      <w:proofErr w:type="spellStart"/>
+      <w:r>
+        <w:rPr>
+          <w:rFonts w:ascii="Arial Narrow" w:hAnsi="Arial Narrow"/>
+          <w:b/>
+          <w:bCs/>
+          <w:sz w:val="24"/>
+          <w:szCs w:val="24"/>
+        </w:rPr>
+        <w:t>Tanggal</w:t>
+      </w:r>
+      <w:proofErr w:type="spellEnd"/>
+      <w:r>
+        <w:rPr>
+          <w:rFonts w:ascii="Arial Narrow" w:hAnsi="Arial Narrow"/>
+          <w:b/>
+          <w:bCs/>
+          <w:sz w:val="24"/>
+          <w:szCs w:val="24"/>
+        </w:rPr>
+        <w:t xml:space="preserve"> (Kolom C):</w:t>
+      </w:r>
+      <w:r>
+        <w:rPr>
+          <w:rFonts w:ascii="Arial Narrow" w:hAnsi="Arial Narrow"/>
+          <w:sz w:val="24"/>
+          <w:szCs w:val="24"/>
+        </w:rPr>
+        <w:t xml:space="preserve"> Baris </w:t>
+      </w:r>
+      <w:proofErr w:type="spellStart"/>
+      <w:r>
+        <w:rPr>
+          <w:rFonts w:ascii="Arial Narrow" w:hAnsi="Arial Narrow"/>
+          <w:sz w:val="24"/>
+          <w:szCs w:val="24"/>
+        </w:rPr>
+        <w:t>kode</w:t>
+      </w:r>
+      <w:proofErr w:type="spellEnd"/>
+      <w:r>
+        <w:rPr>
+          <w:rFonts w:ascii="Arial Narrow" w:hAnsi="Arial Narrow"/>
+          <w:sz w:val="24"/>
+          <w:szCs w:val="24"/>
+        </w:rPr>
+        <w:t xml:space="preserve"> </w:t>
+      </w:r>
+      <w:proofErr w:type="spellStart"/>
+      <w:r>
+        <w:rPr>
+          <w:rFonts w:ascii="Arial Narrow" w:hAnsi="Arial Narrow"/>
+          <w:sz w:val="24"/>
+          <w:szCs w:val="24"/>
+        </w:rPr>
+        <w:t>untuk</w:t>
+      </w:r>
+      <w:proofErr w:type="spellEnd"/>
+      <w:r>
+        <w:rPr>
+          <w:rFonts w:ascii="Arial Narrow" w:hAnsi="Arial Narrow"/>
+          <w:sz w:val="24"/>
+          <w:szCs w:val="24"/>
+        </w:rPr>
+        <w:t xml:space="preserve"> </w:t>
+      </w:r>
+      <w:proofErr w:type="spellStart"/>
+      <w:r>
+        <w:rPr>
+          <w:rFonts w:ascii="Arial Narrow" w:hAnsi="Arial Narrow"/>
+          <w:sz w:val="24"/>
+          <w:szCs w:val="24"/>
+        </w:rPr>
+        <w:t>sel</w:t>
+      </w:r>
+      <w:proofErr w:type="spellEnd"/>
+      <w:r>
+        <w:rPr>
+          <w:rFonts w:ascii="Arial Narrow" w:hAnsi="Arial Narrow"/>
+          <w:sz w:val="24"/>
+          <w:szCs w:val="24"/>
+        </w:rPr>
+        <w:t xml:space="preserve"> C2, C3, dan C4 </w:t>
+      </w:r>
+      <w:proofErr w:type="spellStart"/>
+      <w:r>
+        <w:rPr>
+          <w:rFonts w:ascii="Arial Narrow" w:hAnsi="Arial Narrow"/>
+          <w:sz w:val="24"/>
+          <w:szCs w:val="24"/>
+        </w:rPr>
+        <w:t>berfungsi</w:t>
+      </w:r>
+      <w:proofErr w:type="spellEnd"/>
+      <w:r>
+        <w:rPr>
+          <w:rFonts w:ascii="Arial Narrow" w:hAnsi="Arial Narrow"/>
+          <w:sz w:val="24"/>
+          <w:szCs w:val="24"/>
+        </w:rPr>
+        <w:t xml:space="preserve"> </w:t>
+      </w:r>
+      <w:proofErr w:type="spellStart"/>
+      <w:r>
+        <w:rPr>
+          <w:rFonts w:ascii="Arial Narrow" w:hAnsi="Arial Narrow"/>
+          <w:sz w:val="24"/>
+          <w:szCs w:val="24"/>
+        </w:rPr>
+        <w:t>untuk</w:t>
+      </w:r>
+      <w:proofErr w:type="spellEnd"/>
+      <w:r>
+        <w:rPr>
+          <w:rFonts w:ascii="Arial Narrow" w:hAnsi="Arial Narrow"/>
+          <w:sz w:val="24"/>
+          <w:szCs w:val="24"/>
+        </w:rPr>
+        <w:t xml:space="preserve"> </w:t>
+      </w:r>
+      <w:proofErr w:type="spellStart"/>
+      <w:r>
+        <w:rPr>
+          <w:rFonts w:ascii="Arial Narrow" w:hAnsi="Arial Narrow"/>
+          <w:sz w:val="24"/>
+          <w:szCs w:val="24"/>
+        </w:rPr>
+        <w:t>memasukkan</w:t>
+      </w:r>
+      <w:proofErr w:type="spellEnd"/>
+      <w:r>
+        <w:rPr>
+          <w:rFonts w:ascii="Arial Narrow" w:hAnsi="Arial Narrow"/>
+          <w:sz w:val="24"/>
+          <w:szCs w:val="24"/>
+        </w:rPr>
+        <w:t xml:space="preserve"> </w:t>
+      </w:r>
+      <w:proofErr w:type="spellStart"/>
+      <w:r>
+        <w:rPr>
+          <w:rFonts w:ascii="Arial Narrow" w:hAnsi="Arial Narrow"/>
+          <w:sz w:val="24"/>
+          <w:szCs w:val="24"/>
+        </w:rPr>
+        <w:t>informasi</w:t>
+      </w:r>
+      <w:proofErr w:type="spellEnd"/>
+      <w:r>
+        <w:rPr>
+          <w:rFonts w:ascii="Arial Narrow" w:hAnsi="Arial Narrow"/>
+          <w:sz w:val="24"/>
+          <w:szCs w:val="24"/>
+        </w:rPr>
+        <w:t xml:space="preserve"> </w:t>
+      </w:r>
+      <w:proofErr w:type="spellStart"/>
+      <w:r>
+        <w:rPr>
+          <w:rFonts w:ascii="Arial Narrow" w:hAnsi="Arial Narrow"/>
+          <w:sz w:val="24"/>
+          <w:szCs w:val="24"/>
+        </w:rPr>
+        <w:t>tanggal</w:t>
+      </w:r>
+      <w:proofErr w:type="spellEnd"/>
+      <w:r>
+        <w:rPr>
+          <w:rFonts w:ascii="Arial Narrow" w:hAnsi="Arial Narrow"/>
+          <w:sz w:val="24"/>
+          <w:szCs w:val="24"/>
+        </w:rPr>
+        <w:t xml:space="preserve"> </w:t>
+      </w:r>
+      <w:proofErr w:type="spellStart"/>
+      <w:r>
+        <w:rPr>
+          <w:rFonts w:ascii="Arial Narrow" w:hAnsi="Arial Narrow"/>
+          <w:sz w:val="24"/>
+          <w:szCs w:val="24"/>
+        </w:rPr>
+        <w:t>secara</w:t>
+      </w:r>
+      <w:proofErr w:type="spellEnd"/>
+      <w:r>
+        <w:rPr>
+          <w:rFonts w:ascii="Arial Narrow" w:hAnsi="Arial Narrow"/>
+          <w:sz w:val="24"/>
+          <w:szCs w:val="24"/>
+        </w:rPr>
+        <w:t xml:space="preserve"> </w:t>
+      </w:r>
+      <w:proofErr w:type="spellStart"/>
+      <w:r>
+        <w:rPr>
+          <w:rFonts w:ascii="Arial Narrow" w:hAnsi="Arial Narrow"/>
+          <w:sz w:val="24"/>
+          <w:szCs w:val="24"/>
+        </w:rPr>
+        <w:t>berurutan</w:t>
+      </w:r>
+      <w:proofErr w:type="spellEnd"/>
+      <w:r>
+        <w:rPr>
+          <w:rFonts w:ascii="Arial Narrow" w:hAnsi="Arial Narrow"/>
+          <w:sz w:val="24"/>
+          <w:szCs w:val="24"/>
+        </w:rPr>
+        <w:t xml:space="preserve">, </w:t>
+      </w:r>
+      <w:proofErr w:type="spellStart"/>
+      <w:r>
+        <w:rPr>
+          <w:rFonts w:ascii="Arial Narrow" w:hAnsi="Arial Narrow"/>
+          <w:sz w:val="24"/>
+          <w:szCs w:val="24"/>
+        </w:rPr>
+        <w:t>yaitu</w:t>
+      </w:r>
+      <w:proofErr w:type="spellEnd"/>
+      <w:r>
+        <w:rPr>
+          <w:rFonts w:ascii="Arial Narrow" w:hAnsi="Arial Narrow"/>
+          <w:sz w:val="24"/>
+          <w:szCs w:val="24"/>
+        </w:rPr>
+        <w:t xml:space="preserve"> '1/12', '2/12', dan '3/12'.</w:t>
+      </w:r>
+    </w:p>
+    <w:p>
+      <w:pPr>
+        <w:spacing w:after="0" w:line="240" w:lineRule="auto"/>
+        <w:rPr>
+          <w:rFonts w:ascii="Arial Narrow" w:hAnsi="Arial Narrow"/>
+          <w:sz w:val="24"/>
+          <w:szCs w:val="24"/>
+        </w:rPr>
+      </w:pPr>
+    </w:p>
+    <w:p>
+      <w:pPr>
+        <w:numPr>
+          <w:ilvl w:val="0"/>
+          <w:numId w:val="2"/>
+        </w:numPr>
+        <w:spacing w:after="0" w:line="240" w:lineRule="auto"/>
+        <w:rPr>
+          <w:rFonts w:ascii="Arial Narrow" w:hAnsi="Arial Narrow"/>
+          <w:sz w:val="24"/>
+          <w:szCs w:val="24"/>
+        </w:rPr>
+      </w:pPr>
+      <w:proofErr w:type="spellStart"/>
+      <w:r>
+        <w:rPr>
+          <w:rFonts w:ascii="Arial Narrow" w:hAnsi="Arial Narrow"/>
+          <w:b/>
+          <w:bCs/>
+          <w:sz w:val="24"/>
+          <w:szCs w:val="24"/>
+        </w:rPr>
+        <w:t>Mengisi</w:t>
+      </w:r>
+      <w:proofErr w:type="spellEnd"/>
+      <w:r>
+        <w:rPr>
+          <w:rFonts w:ascii="Arial Narrow" w:hAnsi="Arial Narrow"/>
+          <w:b/>
+          <w:bCs/>
+          <w:sz w:val="24"/>
+          <w:szCs w:val="24"/>
+        </w:rPr>
+        <w:t xml:space="preserve"> Data </w:t>
+      </w:r>
+      <w:proofErr w:type="spellStart"/>
+      <w:r>
+        <w:rPr>
+          <w:rFonts w:ascii="Arial Narrow" w:hAnsi="Arial Narrow"/>
+          <w:b/>
+          <w:bCs/>
+          <w:sz w:val="24"/>
+          <w:szCs w:val="24"/>
+        </w:rPr>
+        <w:t>Keterangan</w:t>
+      </w:r>
+      <w:proofErr w:type="spellEnd"/>
+      <w:r>
+        <w:rPr>
+          <w:rFonts w:ascii="Arial Narrow" w:hAnsi="Arial Narrow"/>
+          <w:b/>
+          <w:bCs/>
+          <w:sz w:val="24"/>
+          <w:szCs w:val="24"/>
+        </w:rPr>
+        <w:t xml:space="preserve"> (Kolom D):</w:t>
+      </w:r>
+      <w:r>
+        <w:rPr>
+          <w:rFonts w:ascii="Arial Narrow" w:hAnsi="Arial Narrow"/>
+          <w:sz w:val="24"/>
+          <w:szCs w:val="24"/>
+        </w:rPr>
+        <w:t xml:space="preserve"> Baris </w:t>
+      </w:r>
+      <w:proofErr w:type="spellStart"/>
+      <w:r>
+        <w:rPr>
+          <w:rFonts w:ascii="Arial Narrow" w:hAnsi="Arial Narrow"/>
+          <w:sz w:val="24"/>
+          <w:szCs w:val="24"/>
+        </w:rPr>
+        <w:t>kode</w:t>
+      </w:r>
+      <w:proofErr w:type="spellEnd"/>
+      <w:r>
+        <w:rPr>
+          <w:rFonts w:ascii="Arial Narrow" w:hAnsi="Arial Narrow"/>
+          <w:sz w:val="24"/>
+          <w:szCs w:val="24"/>
+        </w:rPr>
+        <w:t xml:space="preserve"> </w:t>
+      </w:r>
+      <w:proofErr w:type="spellStart"/>
+      <w:r>
+        <w:rPr>
+          <w:rFonts w:ascii="Arial Narrow" w:hAnsi="Arial Narrow"/>
+          <w:sz w:val="24"/>
+          <w:szCs w:val="24"/>
+        </w:rPr>
+        <w:t>untuk</w:t>
+      </w:r>
+      <w:proofErr w:type="spellEnd"/>
+      <w:r>
+        <w:rPr>
+          <w:rFonts w:ascii="Arial Narrow" w:hAnsi="Arial Narrow"/>
+          <w:sz w:val="24"/>
+          <w:szCs w:val="24"/>
+        </w:rPr>
+        <w:t xml:space="preserve"> </w:t>
+      </w:r>
+      <w:proofErr w:type="spellStart"/>
+      <w:r>
+        <w:rPr>
+          <w:rFonts w:ascii="Arial Narrow" w:hAnsi="Arial Narrow"/>
+          <w:sz w:val="24"/>
+          <w:szCs w:val="24"/>
+        </w:rPr>
+        <w:t>sel</w:t>
+      </w:r>
+      <w:proofErr w:type="spellEnd"/>
+      <w:r>
+        <w:rPr>
+          <w:rFonts w:ascii="Arial Narrow" w:hAnsi="Arial Narrow"/>
+          <w:sz w:val="24"/>
+          <w:szCs w:val="24"/>
+        </w:rPr>
+        <w:t xml:space="preserve"> D2, D3, dan D4 masing-masing </w:t>
+      </w:r>
+      <w:proofErr w:type="spellStart"/>
+      <w:r>
+        <w:rPr>
+          <w:rFonts w:ascii="Arial Narrow" w:hAnsi="Arial Narrow"/>
+          <w:sz w:val="24"/>
+          <w:szCs w:val="24"/>
+        </w:rPr>
+        <w:t>diisi</w:t>
+      </w:r>
+      <w:proofErr w:type="spellEnd"/>
+      <w:r>
+        <w:rPr>
+          <w:rFonts w:ascii="Arial Narrow" w:hAnsi="Arial Narrow"/>
+          <w:sz w:val="24"/>
+          <w:szCs w:val="24"/>
+        </w:rPr>
+        <w:t xml:space="preserve"> </w:t>
+      </w:r>
+      <w:proofErr w:type="spellStart"/>
+      <w:r>
+        <w:rPr>
+          <w:rFonts w:ascii="Arial Narrow" w:hAnsi="Arial Narrow"/>
+          <w:sz w:val="24"/>
+          <w:szCs w:val="24"/>
+        </w:rPr>
+        <w:t>dengan</w:t>
+      </w:r>
+      <w:proofErr w:type="spellEnd"/>
+      <w:r>
+        <w:rPr>
+          <w:rFonts w:ascii="Arial Narrow" w:hAnsi="Arial Narrow"/>
+          <w:sz w:val="24"/>
+          <w:szCs w:val="24"/>
+        </w:rPr>
+        <w:t xml:space="preserve"> status </w:t>
+      </w:r>
+      <w:proofErr w:type="spellStart"/>
+      <w:r>
+        <w:rPr>
+          <w:rFonts w:ascii="Arial Narrow" w:hAnsi="Arial Narrow"/>
+          <w:sz w:val="24"/>
+          <w:szCs w:val="24"/>
+        </w:rPr>
+        <w:t>keterangan</w:t>
+      </w:r>
+      <w:proofErr w:type="spellEnd"/>
+      <w:r>
+        <w:rPr>
+          <w:rFonts w:ascii="Arial Narrow" w:hAnsi="Arial Narrow"/>
+          <w:sz w:val="24"/>
+          <w:szCs w:val="24"/>
+        </w:rPr>
+        <w:t xml:space="preserve"> </w:t>
+      </w:r>
+      <w:proofErr w:type="spellStart"/>
+      <w:r>
+        <w:rPr>
+          <w:rFonts w:ascii="Arial Narrow" w:hAnsi="Arial Narrow"/>
+          <w:sz w:val="24"/>
+          <w:szCs w:val="24"/>
+        </w:rPr>
+        <w:t>kehadiran</w:t>
+      </w:r>
+      <w:proofErr w:type="spellEnd"/>
+      <w:r>
+        <w:rPr>
+          <w:rFonts w:ascii="Arial Narrow" w:hAnsi="Arial Narrow"/>
+          <w:sz w:val="24"/>
+          <w:szCs w:val="24"/>
+        </w:rPr>
+        <w:t xml:space="preserve"> </w:t>
+      </w:r>
+      <w:proofErr w:type="spellStart"/>
+      <w:r>
+        <w:rPr>
+          <w:rFonts w:ascii="Arial Narrow" w:hAnsi="Arial Narrow"/>
+          <w:sz w:val="24"/>
+          <w:szCs w:val="24"/>
+        </w:rPr>
+        <w:t>yaitu</w:t>
+      </w:r>
+      <w:proofErr w:type="spellEnd"/>
+      <w:r>
+        <w:rPr>
+          <w:rFonts w:ascii="Arial Narrow" w:hAnsi="Arial Narrow"/>
+          <w:sz w:val="24"/>
+          <w:szCs w:val="24"/>
+        </w:rPr>
+        <w:t xml:space="preserve"> '</w:t>
+      </w:r>
+      <w:proofErr w:type="spellStart"/>
+      <w:r>
+        <w:rPr>
+          <w:rFonts w:ascii="Arial Narrow" w:hAnsi="Arial Narrow"/>
+          <w:sz w:val="24"/>
+          <w:szCs w:val="24"/>
+        </w:rPr>
+        <w:t>hadir</w:t>
+      </w:r>
+      <w:proofErr w:type="spellEnd"/>
+      <w:r>
+        <w:rPr>
+          <w:rFonts w:ascii="Arial Narrow" w:hAnsi="Arial Narrow"/>
+          <w:sz w:val="24"/>
+          <w:szCs w:val="24"/>
+        </w:rPr>
+        <w:t>', '</w:t>
+      </w:r>
+      <w:proofErr w:type="spellStart"/>
+      <w:r>
+        <w:rPr>
+          <w:rFonts w:ascii="Arial Narrow" w:hAnsi="Arial Narrow"/>
+          <w:sz w:val="24"/>
+          <w:szCs w:val="24"/>
+        </w:rPr>
+        <w:t>absen</w:t>
+      </w:r>
+      <w:proofErr w:type="spellEnd"/>
+      <w:r>
+        <w:rPr>
+          <w:rFonts w:ascii="Arial Narrow" w:hAnsi="Arial Narrow"/>
+          <w:sz w:val="24"/>
+          <w:szCs w:val="24"/>
+        </w:rPr>
+        <w:t>', dan '</w:t>
+      </w:r>
+      <w:proofErr w:type="spellStart"/>
+      <w:r>
+        <w:rPr>
+          <w:rFonts w:ascii="Arial Narrow" w:hAnsi="Arial Narrow"/>
+          <w:sz w:val="24"/>
+          <w:szCs w:val="24"/>
+        </w:rPr>
+        <w:t>ijin</w:t>
+      </w:r>
+      <w:proofErr w:type="spellEnd"/>
+      <w:r>
+        <w:rPr>
+          <w:rFonts w:ascii="Arial Narrow" w:hAnsi="Arial Narrow"/>
+          <w:sz w:val="24"/>
+          <w:szCs w:val="24"/>
+        </w:rPr>
+        <w:t xml:space="preserve">', </w:t>
+      </w:r>
+      <w:proofErr w:type="spellStart"/>
+      <w:r>
+        <w:rPr>
+          <w:rFonts w:ascii="Arial Narrow" w:hAnsi="Arial Narrow"/>
+          <w:sz w:val="24"/>
+          <w:szCs w:val="24"/>
+        </w:rPr>
+        <w:t>diikuti</w:t>
+      </w:r>
+      <w:proofErr w:type="spellEnd"/>
+      <w:r>
+        <w:rPr>
+          <w:rFonts w:ascii="Arial Narrow" w:hAnsi="Arial Narrow"/>
+          <w:sz w:val="24"/>
+          <w:szCs w:val="24"/>
+        </w:rPr>
+        <w:t xml:space="preserve"> oleh baris </w:t>
+      </w:r>
+      <w:proofErr w:type="spellStart"/>
+      <w:r>
+        <w:rPr>
+          <w:rFonts w:ascii="Arial Narrow" w:hAnsi="Arial Narrow"/>
+          <w:sz w:val="24"/>
+          <w:szCs w:val="24"/>
+        </w:rPr>
+        <w:t>terakhir</w:t>
+      </w:r>
+      <w:proofErr w:type="spellEnd"/>
+      <w:r>
+        <w:rPr>
+          <w:rFonts w:ascii="Arial Narrow" w:hAnsi="Arial Narrow"/>
+          <w:sz w:val="24"/>
+          <w:szCs w:val="24"/>
+        </w:rPr>
+        <w:t xml:space="preserve"> </w:t>
+      </w:r>
+      <w:proofErr w:type="spellStart"/>
+      <w:proofErr w:type="gramStart"/>
+      <w:r>
+        <w:rPr>
+          <w:rFonts w:ascii="Arial Narrow" w:hAnsi="Arial Narrow"/>
+          <w:sz w:val="24"/>
+          <w:szCs w:val="24"/>
+        </w:rPr>
+        <w:t>spreadsheet.getRange</w:t>
+      </w:r>
+      <w:proofErr w:type="spellEnd"/>
+      <w:proofErr w:type="gramEnd"/>
+      <w:r>
+        <w:rPr>
+          <w:rFonts w:ascii="Arial Narrow" w:hAnsi="Arial Narrow"/>
+          <w:sz w:val="24"/>
+          <w:szCs w:val="24"/>
+        </w:rPr>
+        <w:t>('D5'</w:t>
+      </w:r>
+      <w:proofErr w:type="gramStart"/>
+      <w:r>
+        <w:rPr>
+          <w:rFonts w:ascii="Arial Narrow" w:hAnsi="Arial Narrow"/>
+          <w:sz w:val="24"/>
+          <w:szCs w:val="24"/>
+        </w:rPr>
+        <w:t>).activate</w:t>
+      </w:r>
+      <w:proofErr w:type="gramEnd"/>
+      <w:r>
+        <w:rPr>
+          <w:rFonts w:ascii="Arial Narrow" w:hAnsi="Arial Narrow"/>
+          <w:sz w:val="24"/>
+          <w:szCs w:val="24"/>
+        </w:rPr>
+        <w:t xml:space="preserve">(); yang </w:t>
+      </w:r>
+      <w:proofErr w:type="spellStart"/>
+      <w:r>
+        <w:rPr>
+          <w:rFonts w:ascii="Arial Narrow" w:hAnsi="Arial Narrow"/>
+          <w:sz w:val="24"/>
+          <w:szCs w:val="24"/>
+        </w:rPr>
+        <w:t>mengaktifkan</w:t>
+      </w:r>
+      <w:proofErr w:type="spellEnd"/>
+      <w:r>
+        <w:rPr>
+          <w:rFonts w:ascii="Arial Narrow" w:hAnsi="Arial Narrow"/>
+          <w:sz w:val="24"/>
+          <w:szCs w:val="24"/>
+        </w:rPr>
+        <w:t xml:space="preserve"> </w:t>
+      </w:r>
+      <w:proofErr w:type="spellStart"/>
+      <w:r>
+        <w:rPr>
+          <w:rFonts w:ascii="Arial Narrow" w:hAnsi="Arial Narrow"/>
+          <w:sz w:val="24"/>
+          <w:szCs w:val="24"/>
+        </w:rPr>
+        <w:t>sel</w:t>
+      </w:r>
+      <w:proofErr w:type="spellEnd"/>
+      <w:r>
+        <w:rPr>
+          <w:rFonts w:ascii="Arial Narrow" w:hAnsi="Arial Narrow"/>
+          <w:sz w:val="24"/>
+          <w:szCs w:val="24"/>
+        </w:rPr>
+        <w:t xml:space="preserve"> D5 (</w:t>
+      </w:r>
+      <w:proofErr w:type="spellStart"/>
+      <w:r>
+        <w:rPr>
+          <w:rFonts w:ascii="Arial Narrow" w:hAnsi="Arial Narrow"/>
+          <w:sz w:val="24"/>
+          <w:szCs w:val="24"/>
+        </w:rPr>
+        <w:t>meskipun</w:t>
+      </w:r>
+      <w:proofErr w:type="spellEnd"/>
+      <w:r>
+        <w:rPr>
+          <w:rFonts w:ascii="Arial Narrow" w:hAnsi="Arial Narrow"/>
+          <w:sz w:val="24"/>
+          <w:szCs w:val="24"/>
+        </w:rPr>
+        <w:t xml:space="preserve"> </w:t>
+      </w:r>
+      <w:proofErr w:type="spellStart"/>
+      <w:r>
+        <w:rPr>
+          <w:rFonts w:ascii="Arial Narrow" w:hAnsi="Arial Narrow"/>
+          <w:sz w:val="24"/>
+          <w:szCs w:val="24"/>
+        </w:rPr>
+        <w:t>nilainya</w:t>
+      </w:r>
+      <w:proofErr w:type="spellEnd"/>
+      <w:r>
+        <w:rPr>
+          <w:rFonts w:ascii="Arial Narrow" w:hAnsi="Arial Narrow"/>
+          <w:sz w:val="24"/>
+          <w:szCs w:val="24"/>
+        </w:rPr>
+        <w:t xml:space="preserve"> </w:t>
+      </w:r>
+      <w:proofErr w:type="spellStart"/>
+      <w:r>
+        <w:rPr>
+          <w:rFonts w:ascii="Arial Narrow" w:hAnsi="Arial Narrow"/>
+          <w:sz w:val="24"/>
+          <w:szCs w:val="24"/>
+        </w:rPr>
+        <w:t>tidak</w:t>
+      </w:r>
+      <w:proofErr w:type="spellEnd"/>
+      <w:r>
+        <w:rPr>
+          <w:rFonts w:ascii="Arial Narrow" w:hAnsi="Arial Narrow"/>
+          <w:sz w:val="24"/>
+          <w:szCs w:val="24"/>
+        </w:rPr>
+        <w:t xml:space="preserve"> </w:t>
+      </w:r>
+      <w:proofErr w:type="spellStart"/>
+      <w:r>
+        <w:rPr>
+          <w:rFonts w:ascii="Arial Narrow" w:hAnsi="Arial Narrow"/>
+          <w:sz w:val="24"/>
+          <w:szCs w:val="24"/>
+        </w:rPr>
+        <w:t>diisi</w:t>
+      </w:r>
+      <w:proofErr w:type="spellEnd"/>
+      <w:r>
+        <w:rPr>
+          <w:rFonts w:ascii="Arial Narrow" w:hAnsi="Arial Narrow"/>
+          <w:sz w:val="24"/>
+          <w:szCs w:val="24"/>
+        </w:rPr>
+        <w:t xml:space="preserve"> </w:t>
+      </w:r>
+      <w:proofErr w:type="spellStart"/>
+      <w:r>
+        <w:rPr>
+          <w:rFonts w:ascii="Arial Narrow" w:hAnsi="Arial Narrow"/>
+          <w:sz w:val="24"/>
+          <w:szCs w:val="24"/>
+        </w:rPr>
+        <w:t>setelahnya</w:t>
+      </w:r>
+      <w:proofErr w:type="spellEnd"/>
+      <w:r>
+        <w:rPr>
+          <w:rFonts w:ascii="Arial Narrow" w:hAnsi="Arial Narrow"/>
+          <w:sz w:val="24"/>
+          <w:szCs w:val="24"/>
+        </w:rPr>
+        <w:t>).</w:t>
+      </w:r>
+    </w:p>
+    <w:p>
+      <w:pPr>
+        <w:spacing w:after="0" w:line="240" w:lineRule="auto"/>
+        <w:rPr>
+          <w:rFonts w:ascii="Arial Narrow" w:hAnsi="Arial Narrow"/>
+          <w:sz w:val="24"/>
+          <w:szCs w:val="24"/>
+        </w:rPr>
+      </w:pPr>
+    </w:p>
+    <w:p>
+      <w:pPr>
+        <w:spacing w:after="0" w:line="240" w:lineRule="auto"/>
+        <w:rPr>
+          <w:rFonts w:ascii="Arial Narrow" w:hAnsi="Arial Narrow"/>
+          <w:sz w:val="24"/>
+          <w:szCs w:val="24"/>
+        </w:rPr>
+      </w:pPr>
+      <w:proofErr w:type="spellStart"/>
+      <w:r>
+        <w:rPr>
+          <w:rFonts w:ascii="Arial Narrow" w:hAnsi="Arial Narrow"/>
+          <w:sz w:val="24"/>
+          <w:szCs w:val="24"/>
+        </w:rPr>
+        <w:t>Zcvzxcvzx</w:t>
+      </w:r>
+      <w:proofErr w:type="spellEnd"/>
+    </w:p>
+    <w:p>
+      <w:pPr>
+        <w:spacing w:after="0" w:line="240" w:lineRule="auto"/>
+        <w:rPr>
+          <w:rFonts w:ascii="Arial Narrow" w:hAnsi="Arial Narrow"/>
+          <w:sz w:val="24"/>
+          <w:szCs w:val="24"/>
+        </w:rPr>
+      </w:pPr>
+      <w:proofErr w:type="spellStart"/>
+      <w:r>
+        <w:rPr>
+          <w:rFonts w:ascii="Arial Narrow" w:hAnsi="Arial Narrow"/>
+          <w:sz w:val="24"/>
+          <w:szCs w:val="24"/>
+        </w:rPr>
+        <w:t>Dassd</w:t>
+      </w:r>
+      <w:proofErr w:type="spellEnd"/>
+    </w:p>
+    <w:p>
+      <w:pPr>
+        <w:spacing w:after="0" w:line="240" w:lineRule="auto"/>
+        <w:rPr>
+          <w:rFonts w:ascii="Arial Narrow" w:hAnsi="Arial Narrow"/>
+          <w:sz w:val="24"/>
+          <w:szCs w:val="24"/>
+        </w:rPr>
+      </w:pPr>
+      <w:proofErr w:type="spellStart"/>
+      <w:r>
+        <w:rPr>
+          <w:rFonts w:ascii="Arial Narrow" w:hAnsi="Arial Narrow"/>
+          <w:sz w:val="24"/>
+          <w:szCs w:val="24"/>
+        </w:rPr>
+        <w:t>Asdgasdg</w:t>
+      </w:r>
+      <w:proofErr w:type="spellEnd"/>
+    </w:p>
+    <w:p>
+      <w:pPr>
+        <w:spacing w:after="0" w:line="240" w:lineRule="auto"/>
+        <w:rPr>
+          <w:rFonts w:ascii="Arial Narrow" w:hAnsi="Arial Narrow"/>
+          <w:sz w:val="24"/>
+          <w:szCs w:val="24"/>
+        </w:rPr>
+      </w:pPr>
+    </w:p>
     <w:sectPr>
-      <w:footerReference w:type="default" r:id="rId6"/>
+      <w:footerReference w:type="default" r:id="rId19"/>
       <w:pgSz w:w="11906" w:h="16838"/>
       <w:pgMar w:top="568" w:right="1440" w:bottom="1440" w:left="1440" w:header="708" w:footer="0" w:gutter="0"/>
       <w:cols w:space="708"/>
@@ -357,6 +3930,255 @@
     </w:p>
   </w:footnote>
 </w:footnotes>
+</file>
+
+<file path=word/numbering.xml><?xml version="1.0" encoding="utf-8"?>
+<w:numbering xmlns:wpc="http://schemas.microsoft.com/office/word/2010/wordprocessingCanvas" xmlns:cx="http://schemas.microsoft.com/office/drawing/2014/chartex" xmlns:cx1="http://schemas.microsoft.com/office/drawing/2015/9/8/chartex" xmlns:cx2="http://schemas.microsoft.com/office/drawing/2015/10/21/chartex" xmlns:cx3="http://schemas.microsoft.com/office/drawing/2016/5/9/chartex" xmlns:cx4="http://schemas.microsoft.com/office/drawing/2016/5/10/chartex" xmlns:cx5="http://schemas.microsoft.com/office/drawing/2016/5/11/chartex" xmlns:cx6="http://schemas.microsoft.com/office/drawing/2016/5/12/chartex" xmlns:cx7="http://schemas.microsoft.com/office/drawing/2016/5/13/chartex" xmlns:cx8="http://schemas.microsoft.com/office/drawing/2016/5/14/chartex" xmlns:mc="http://schemas.openxmlformats.org/markup-compatibility/2006" xmlns:aink="http://schemas.microsoft.com/office/drawing/2016/ink" xmlns:am3d="http://schemas.microsoft.com/office/drawing/2017/model3d" xmlns:o="urn:schemas-microsoft-com:office:office" xmlns:oel="http://schemas.microsoft.com/office/2019/extlst" xmlns:r="http://schemas.openxmlformats.org/officeDocument/2006/relationships" xmlns:m="http://schemas.openxmlformats.org/officeDocument/2006/math" xmlns:v="urn:schemas-microsoft-com:vml" xmlns:wp14="http://schemas.microsoft.com/office/word/2010/wordprocessingDrawing" xmlns:wp="http://schemas.openxmlformats.org/drawingml/2006/wordprocessingDrawing" xmlns:w10="urn:schemas-microsoft-com:office:word" xmlns:w="http://schemas.openxmlformats.org/wordprocessingml/2006/main" xmlns:w14="http://schemas.microsoft.com/office/word/2010/wordml" xmlns:w15="http://schemas.microsoft.com/office/word/2012/wordml" xmlns:w16cex="http://schemas.microsoft.com/office/word/2018/wordml/cex" xmlns:w16cid="http://schemas.microsoft.com/office/word/2016/wordml/cid" xmlns:w16="http://schemas.microsoft.com/office/word/2018/wordml" xmlns:w16du="http://schemas.microsoft.com/office/word/2023/wordml/word16du" xmlns:w16sdtdh="http://schemas.microsoft.com/office/word/2020/wordml/sdtdatahash" xmlns:w16sdtfl="http://schemas.microsoft.com/office/word/2024/wordml/sdtformatlock" xmlns:w16se="http://schemas.microsoft.com/office/word/2015/wordml/symex" xmlns:wpg="http://schemas.microsoft.com/office/word/2010/wordprocessingGroup" xmlns:wpi="http://schemas.microsoft.com/office/word/2010/wordprocessingInk" xmlns:wne="http://schemas.microsoft.com/office/word/2006/wordml" xmlns:wps="http://schemas.microsoft.com/office/word/2010/wordprocessingShape" mc:Ignorable="w14 w15 w16se w16cid w16 w16cex w16sdtdh w16sdtfl w16du wp14">
+  <w:abstractNum w:abstractNumId="0" w15:restartNumberingAfterBreak="0">
+    <w:nsid w:val="32287371"/>
+    <w:multiLevelType w:val="hybridMultilevel"/>
+    <w:tmpl w:val="F81AB4B6"/>
+    <w:lvl w:ilvl="0" w:tplc="3809000F">
+      <w:start w:val="1"/>
+      <w:numFmt w:val="decimal"/>
+      <w:lvlText w:val="%1."/>
+      <w:lvlJc w:val="left"/>
+      <w:pPr>
+        <w:ind w:left="360" w:hanging="360"/>
+      </w:pPr>
+      <w:rPr>
+        <w:rFonts w:hint="default"/>
+      </w:rPr>
+    </w:lvl>
+    <w:lvl w:ilvl="1" w:tplc="38090019" w:tentative="1">
+      <w:start w:val="1"/>
+      <w:numFmt w:val="lowerLetter"/>
+      <w:lvlText w:val="%2."/>
+      <w:lvlJc w:val="left"/>
+      <w:pPr>
+        <w:ind w:left="1080" w:hanging="360"/>
+      </w:pPr>
+    </w:lvl>
+    <w:lvl w:ilvl="2" w:tplc="3809001B" w:tentative="1">
+      <w:start w:val="1"/>
+      <w:numFmt w:val="lowerRoman"/>
+      <w:lvlText w:val="%3."/>
+      <w:lvlJc w:val="right"/>
+      <w:pPr>
+        <w:ind w:left="1800" w:hanging="180"/>
+      </w:pPr>
+    </w:lvl>
+    <w:lvl w:ilvl="3" w:tplc="3809000F" w:tentative="1">
+      <w:start w:val="1"/>
+      <w:numFmt w:val="decimal"/>
+      <w:lvlText w:val="%4."/>
+      <w:lvlJc w:val="left"/>
+      <w:pPr>
+        <w:ind w:left="2520" w:hanging="360"/>
+      </w:pPr>
+    </w:lvl>
+    <w:lvl w:ilvl="4" w:tplc="38090019" w:tentative="1">
+      <w:start w:val="1"/>
+      <w:numFmt w:val="lowerLetter"/>
+      <w:lvlText w:val="%5."/>
+      <w:lvlJc w:val="left"/>
+      <w:pPr>
+        <w:ind w:left="3240" w:hanging="360"/>
+      </w:pPr>
+    </w:lvl>
+    <w:lvl w:ilvl="5" w:tplc="3809001B" w:tentative="1">
+      <w:start w:val="1"/>
+      <w:numFmt w:val="lowerRoman"/>
+      <w:lvlText w:val="%6."/>
+      <w:lvlJc w:val="right"/>
+      <w:pPr>
+        <w:ind w:left="3960" w:hanging="180"/>
+      </w:pPr>
+    </w:lvl>
+    <w:lvl w:ilvl="6" w:tplc="3809000F" w:tentative="1">
+      <w:start w:val="1"/>
+      <w:numFmt w:val="decimal"/>
+      <w:lvlText w:val="%7."/>
+      <w:lvlJc w:val="left"/>
+      <w:pPr>
+        <w:ind w:left="4680" w:hanging="360"/>
+      </w:pPr>
+    </w:lvl>
+    <w:lvl w:ilvl="7" w:tplc="38090019" w:tentative="1">
+      <w:start w:val="1"/>
+      <w:numFmt w:val="lowerLetter"/>
+      <w:lvlText w:val="%8."/>
+      <w:lvlJc w:val="left"/>
+      <w:pPr>
+        <w:ind w:left="5400" w:hanging="360"/>
+      </w:pPr>
+    </w:lvl>
+    <w:lvl w:ilvl="8" w:tplc="3809001B" w:tentative="1">
+      <w:start w:val="1"/>
+      <w:numFmt w:val="lowerRoman"/>
+      <w:lvlText w:val="%9."/>
+      <w:lvlJc w:val="right"/>
+      <w:pPr>
+        <w:ind w:left="6120" w:hanging="180"/>
+      </w:pPr>
+    </w:lvl>
+  </w:abstractNum>
+  <w:abstractNum w:abstractNumId="1" w15:restartNumberingAfterBreak="0">
+    <w:nsid w:val="66436C78"/>
+    <w:multiLevelType w:val="multilevel"/>
+    <w:tmpl w:val="F22E6F68"/>
+    <w:lvl w:ilvl="0">
+      <w:start w:val="1"/>
+      <w:numFmt w:val="bullet"/>
+      <w:lvlText w:val=""/>
+      <w:lvlJc w:val="left"/>
+      <w:pPr>
+        <w:tabs>
+          <w:tab w:val="num" w:pos="720"/>
+        </w:tabs>
+        <w:ind w:left="720" w:hanging="360"/>
+      </w:pPr>
+      <w:rPr>
+        <w:rFonts w:ascii="Symbol" w:hAnsi="Symbol" w:hint="default"/>
+        <w:sz w:val="20"/>
+      </w:rPr>
+    </w:lvl>
+    <w:lvl w:ilvl="1" w:tentative="1">
+      <w:start w:val="1"/>
+      <w:numFmt w:val="bullet"/>
+      <w:lvlText w:val="o"/>
+      <w:lvlJc w:val="left"/>
+      <w:pPr>
+        <w:tabs>
+          <w:tab w:val="num" w:pos="1440"/>
+        </w:tabs>
+        <w:ind w:left="1440" w:hanging="360"/>
+      </w:pPr>
+      <w:rPr>
+        <w:rFonts w:ascii="Courier New" w:hAnsi="Courier New" w:hint="default"/>
+        <w:sz w:val="20"/>
+      </w:rPr>
+    </w:lvl>
+    <w:lvl w:ilvl="2" w:tentative="1">
+      <w:start w:val="1"/>
+      <w:numFmt w:val="bullet"/>
+      <w:lvlText w:val=""/>
+      <w:lvlJc w:val="left"/>
+      <w:pPr>
+        <w:tabs>
+          <w:tab w:val="num" w:pos="2160"/>
+        </w:tabs>
+        <w:ind w:left="2160" w:hanging="360"/>
+      </w:pPr>
+      <w:rPr>
+        <w:rFonts w:ascii="Wingdings" w:hAnsi="Wingdings" w:hint="default"/>
+        <w:sz w:val="20"/>
+      </w:rPr>
+    </w:lvl>
+    <w:lvl w:ilvl="3" w:tentative="1">
+      <w:start w:val="1"/>
+      <w:numFmt w:val="bullet"/>
+      <w:lvlText w:val=""/>
+      <w:lvlJc w:val="left"/>
+      <w:pPr>
+        <w:tabs>
+          <w:tab w:val="num" w:pos="2880"/>
+        </w:tabs>
+        <w:ind w:left="2880" w:hanging="360"/>
+      </w:pPr>
+      <w:rPr>
+        <w:rFonts w:ascii="Wingdings" w:hAnsi="Wingdings" w:hint="default"/>
+        <w:sz w:val="20"/>
+      </w:rPr>
+    </w:lvl>
+    <w:lvl w:ilvl="4" w:tentative="1">
+      <w:start w:val="1"/>
+      <w:numFmt w:val="bullet"/>
+      <w:lvlText w:val=""/>
+      <w:lvlJc w:val="left"/>
+      <w:pPr>
+        <w:tabs>
+          <w:tab w:val="num" w:pos="3600"/>
+        </w:tabs>
+        <w:ind w:left="3600" w:hanging="360"/>
+      </w:pPr>
+      <w:rPr>
+        <w:rFonts w:ascii="Wingdings" w:hAnsi="Wingdings" w:hint="default"/>
+        <w:sz w:val="20"/>
+      </w:rPr>
+    </w:lvl>
+    <w:lvl w:ilvl="5" w:tentative="1">
+      <w:start w:val="1"/>
+      <w:numFmt w:val="bullet"/>
+      <w:lvlText w:val=""/>
+      <w:lvlJc w:val="left"/>
+      <w:pPr>
+        <w:tabs>
+          <w:tab w:val="num" w:pos="4320"/>
+        </w:tabs>
+        <w:ind w:left="4320" w:hanging="360"/>
+      </w:pPr>
+      <w:rPr>
+        <w:rFonts w:ascii="Wingdings" w:hAnsi="Wingdings" w:hint="default"/>
+        <w:sz w:val="20"/>
+      </w:rPr>
+    </w:lvl>
+    <w:lvl w:ilvl="6" w:tentative="1">
+      <w:start w:val="1"/>
+      <w:numFmt w:val="bullet"/>
+      <w:lvlText w:val=""/>
+      <w:lvlJc w:val="left"/>
+      <w:pPr>
+        <w:tabs>
+          <w:tab w:val="num" w:pos="5040"/>
+        </w:tabs>
+        <w:ind w:left="5040" w:hanging="360"/>
+      </w:pPr>
+      <w:rPr>
+        <w:rFonts w:ascii="Wingdings" w:hAnsi="Wingdings" w:hint="default"/>
+        <w:sz w:val="20"/>
+      </w:rPr>
+    </w:lvl>
+    <w:lvl w:ilvl="7" w:tentative="1">
+      <w:start w:val="1"/>
+      <w:numFmt w:val="bullet"/>
+      <w:lvlText w:val=""/>
+      <w:lvlJc w:val="left"/>
+      <w:pPr>
+        <w:tabs>
+          <w:tab w:val="num" w:pos="5760"/>
+        </w:tabs>
+        <w:ind w:left="5760" w:hanging="360"/>
+      </w:pPr>
+      <w:rPr>
+        <w:rFonts w:ascii="Wingdings" w:hAnsi="Wingdings" w:hint="default"/>
+        <w:sz w:val="20"/>
+      </w:rPr>
+    </w:lvl>
+    <w:lvl w:ilvl="8" w:tentative="1">
+      <w:start w:val="1"/>
+      <w:numFmt w:val="bullet"/>
+      <w:lvlText w:val=""/>
+      <w:lvlJc w:val="left"/>
+      <w:pPr>
+        <w:tabs>
+          <w:tab w:val="num" w:pos="6480"/>
+        </w:tabs>
+        <w:ind w:left="6480" w:hanging="360"/>
+      </w:pPr>
+      <w:rPr>
+        <w:rFonts w:ascii="Wingdings" w:hAnsi="Wingdings" w:hint="default"/>
+        <w:sz w:val="20"/>
+      </w:rPr>
+    </w:lvl>
+  </w:abstractNum>
+  <w:num w:numId="1" w16cid:durableId="1003358658">
+    <w:abstractNumId w:val="0"/>
+  </w:num>
+  <w:num w:numId="2" w16cid:durableId="1123964854">
+    <w:abstractNumId w:val="1"/>
+  </w:num>
+</w:numbering>
 </file>
 
 <file path=word/styles.xml><?xml version="1.0" encoding="utf-8"?>
@@ -962,7 +4784,6 @@
   <w:style w:type="character" w:default="1" w:styleId="DefaultParagraphFont">
     <w:name w:val="Default Paragraph Font"/>
     <w:uiPriority w:val="1"/>
-    <w:semiHidden/>
     <w:unhideWhenUsed/>
   </w:style>
   <w:style w:type="table" w:default="1" w:styleId="TableNormal">
@@ -1320,6 +5141,29 @@
     <w:uiPriority w:val="99"/>
     <w:rsid w:val="0061476F"/>
   </w:style>
+  <w:style w:type="character" w:styleId="Hyperlink">
+    <w:name w:val="Hyperlink"/>
+    <w:basedOn w:val="DefaultParagraphFont"/>
+    <w:uiPriority w:val="99"/>
+    <w:unhideWhenUsed/>
+    <w:rsid w:val="007F722D"/>
+    <w:rPr>
+      <w:color w:val="0563C1" w:themeColor="hyperlink"/>
+      <w:u w:val="single"/>
+    </w:rPr>
+  </w:style>
+  <w:style w:type="character" w:styleId="UnresolvedMention">
+    <w:name w:val="Unresolved Mention"/>
+    <w:basedOn w:val="DefaultParagraphFont"/>
+    <w:uiPriority w:val="99"/>
+    <w:semiHidden/>
+    <w:unhideWhenUsed/>
+    <w:rsid w:val="007F722D"/>
+    <w:rPr>
+      <w:color w:val="605E5C"/>
+      <w:shd w:val="clear" w:color="auto" w:fill="E1DFDD"/>
+    </w:rPr>
+  </w:style>
 </w:styles>
 </file>
 

</xml_diff>

<commit_message>
add title video 6
</commit_message>
<xml_diff>
--- a/note googlespreedsheet.docx
+++ b/note googlespreedsheet.docx
@@ -154,7 +154,7 @@
           <w:noProof/>
         </w:rPr>
         <w:drawing>
-          <wp:inline distT="0" distB="0" distL="0" distR="0" wp14:anchorId="03EC4E1B" wp14:editId="7C4F0FDD">
+          <wp:inline distT="0" distB="0" distL="0" distR="0" wp14:anchorId="03EC4E1B" wp14:editId="4A22080D">
             <wp:extent cx="5731510" cy="1471930"/>
             <wp:effectExtent l="0" t="0" r="2540" b="0"/>
             <wp:docPr id="1271658481" name="Picture 3"/>
@@ -3496,6 +3496,7 @@
       <w:r>
         <w:rPr>
           <w:rFonts w:ascii="Arial Narrow" w:hAnsi="Arial Narrow"/>
+          <w:noProof/>
           <w:sz w:val="24"/>
           <w:szCs w:val="24"/>
         </w:rPr>
@@ -3548,6 +3549,7 @@
       <w:r>
         <w:rPr>
           <w:rFonts w:ascii="Arial Narrow" w:hAnsi="Arial Narrow"/>
+          <w:noProof/>
           <w:sz w:val="24"/>
           <w:szCs w:val="24"/>
         </w:rPr>
@@ -3600,6 +3602,7 @@
       <w:r>
         <w:rPr>
           <w:rFonts w:ascii="Arial Narrow" w:hAnsi="Arial Narrow"/>
+          <w:noProof/>
           <w:sz w:val="24"/>
           <w:szCs w:val="24"/>
         </w:rPr>
@@ -3652,6 +3655,7 @@
       <w:r>
         <w:rPr>
           <w:rFonts w:ascii="Arial Narrow" w:hAnsi="Arial Narrow"/>
+          <w:noProof/>
           <w:sz w:val="24"/>
           <w:szCs w:val="24"/>
         </w:rPr>
@@ -3704,6 +3708,7 @@
       <w:r>
         <w:rPr>
           <w:rFonts w:ascii="Arial Narrow" w:hAnsi="Arial Narrow"/>
+          <w:noProof/>
           <w:sz w:val="24"/>
           <w:szCs w:val="24"/>
         </w:rPr>
@@ -3757,6 +3762,7 @@
       <w:r>
         <w:rPr>
           <w:rFonts w:ascii="Arial Narrow" w:hAnsi="Arial Narrow"/>
+          <w:noProof/>
           <w:sz w:val="24"/>
           <w:szCs w:val="24"/>
         </w:rPr>
@@ -3795,6 +3801,35 @@
             </a:graphic>
           </wp:inline>
         </w:drawing>
+      </w:r>
+    </w:p>
+    <w:p>
+      <w:pPr>
+        <w:spacing w:after="0" w:line="240" w:lineRule="auto"/>
+        <w:rPr>
+          <w:rFonts w:ascii="Arial Narrow" w:hAnsi="Arial Narrow"/>
+          <w:sz w:val="24"/>
+          <w:szCs w:val="24"/>
+        </w:rPr>
+      </w:pPr>
+    </w:p>
+    <w:p>
+      <w:pPr>
+        <w:spacing w:after="0" w:line="240" w:lineRule="auto"/>
+        <w:jc w:val="center"/>
+        <w:rPr>
+          <w:rFonts w:ascii="Arial Narrow" w:hAnsi="Arial Narrow"/>
+          <w:sz w:val="24"/>
+          <w:szCs w:val="24"/>
+        </w:rPr>
+      </w:pPr>
+      <w:r>
+        <w:rPr>
+          <w:rFonts w:ascii="Arial Narrow" w:hAnsi="Arial Narrow"/>
+          <w:sz w:val="24"/>
+          <w:szCs w:val="24"/>
+        </w:rPr>
+        <w:t>006 - Operator Logika pada Google Apps Script</w:t>
       </w:r>
     </w:p>
     <w:p>

</xml_diff>